<commit_message>
update seminar 2_1, added graphs
</commit_message>
<xml_diff>
--- a/Word/Sem2_1.docx
+++ b/Word/Sem2_1.docx
@@ -44,7 +44,6 @@
           <w:szCs w:val="22"/>
         </w:rPr>
       </w:pPr>
-      <w:proofErr w:type="spellStart"/>
       <w:r>
         <w:rPr>
           <w:rFonts w:asciiTheme="minorHAnsi" w:eastAsiaTheme="minorHAnsi" w:hAnsiTheme="minorHAnsi" w:cstheme="minorBidi"/>
@@ -54,403 +53,7 @@
           <w:sz w:val="22"/>
           <w:szCs w:val="22"/>
         </w:rPr>
-        <w:t>time</w:t>
-      </w:r>
-      <w:proofErr w:type="spellEnd"/>
-      <w:r>
-        <w:rPr>
-          <w:rFonts w:asciiTheme="minorHAnsi" w:eastAsiaTheme="minorHAnsi" w:hAnsiTheme="minorHAnsi" w:cstheme="minorBidi"/>
-          <w:b/>
-          <w:bCs/>
-          <w:color w:val="auto"/>
-          <w:sz w:val="22"/>
-          <w:szCs w:val="22"/>
-        </w:rPr>
-        <w:t xml:space="preserve">, </w:t>
-      </w:r>
-      <w:proofErr w:type="spellStart"/>
-      <w:r>
-        <w:rPr>
-          <w:rFonts w:asciiTheme="minorHAnsi" w:eastAsiaTheme="minorHAnsi" w:hAnsiTheme="minorHAnsi" w:cstheme="minorBidi"/>
-          <w:b/>
-          <w:bCs/>
-          <w:color w:val="auto"/>
-          <w:sz w:val="22"/>
-          <w:szCs w:val="22"/>
-        </w:rPr>
-        <w:t>prepare</w:t>
-      </w:r>
-      <w:proofErr w:type="spellEnd"/>
-      <w:r>
-        <w:rPr>
-          <w:rFonts w:asciiTheme="minorHAnsi" w:eastAsiaTheme="minorHAnsi" w:hAnsiTheme="minorHAnsi" w:cstheme="minorBidi"/>
-          <w:b/>
-          <w:bCs/>
-          <w:color w:val="auto"/>
-          <w:sz w:val="22"/>
-          <w:szCs w:val="22"/>
-        </w:rPr>
-        <w:t xml:space="preserve">, </w:t>
-      </w:r>
-      <w:proofErr w:type="spellStart"/>
-      <w:r>
-        <w:rPr>
-          <w:rFonts w:asciiTheme="minorHAnsi" w:eastAsiaTheme="minorHAnsi" w:hAnsiTheme="minorHAnsi" w:cstheme="minorBidi"/>
-          <w:b/>
-          <w:bCs/>
-          <w:color w:val="auto"/>
-          <w:sz w:val="22"/>
-          <w:szCs w:val="22"/>
-        </w:rPr>
-        <w:t>solution</w:t>
-      </w:r>
-      <w:proofErr w:type="spellEnd"/>
-      <w:r>
-        <w:rPr>
-          <w:rFonts w:asciiTheme="minorHAnsi" w:eastAsiaTheme="minorHAnsi" w:hAnsiTheme="minorHAnsi" w:cstheme="minorBidi"/>
-          <w:b/>
-          <w:bCs/>
-          <w:color w:val="auto"/>
-          <w:sz w:val="22"/>
-          <w:szCs w:val="22"/>
-        </w:rPr>
-        <w:t xml:space="preserve">, make, </w:t>
-      </w:r>
-      <w:proofErr w:type="spellStart"/>
-      <w:r>
-        <w:rPr>
-          <w:rFonts w:asciiTheme="minorHAnsi" w:eastAsiaTheme="minorHAnsi" w:hAnsiTheme="minorHAnsi" w:cstheme="minorBidi"/>
-          <w:b/>
-          <w:bCs/>
-          <w:color w:val="auto"/>
-          <w:sz w:val="22"/>
-          <w:szCs w:val="22"/>
-        </w:rPr>
-        <w:t>mistake</w:t>
-      </w:r>
-      <w:proofErr w:type="spellEnd"/>
-      <w:r>
-        <w:rPr>
-          <w:rFonts w:asciiTheme="minorHAnsi" w:eastAsiaTheme="minorHAnsi" w:hAnsiTheme="minorHAnsi" w:cstheme="minorBidi"/>
-          <w:b/>
-          <w:bCs/>
-          <w:color w:val="auto"/>
-          <w:sz w:val="22"/>
-          <w:szCs w:val="22"/>
-        </w:rPr>
-        <w:t xml:space="preserve">, no, </w:t>
-      </w:r>
-      <w:proofErr w:type="spellStart"/>
-      <w:r>
-        <w:rPr>
-          <w:rFonts w:asciiTheme="minorHAnsi" w:eastAsiaTheme="minorHAnsi" w:hAnsiTheme="minorHAnsi" w:cstheme="minorBidi"/>
-          <w:b/>
-          <w:bCs/>
-          <w:color w:val="auto"/>
-          <w:sz w:val="22"/>
-          <w:szCs w:val="22"/>
-        </w:rPr>
-        <w:t>the</w:t>
-      </w:r>
-      <w:proofErr w:type="spellEnd"/>
-      <w:r>
-        <w:rPr>
-          <w:rFonts w:asciiTheme="minorHAnsi" w:eastAsiaTheme="minorHAnsi" w:hAnsiTheme="minorHAnsi" w:cstheme="minorBidi"/>
-          <w:b/>
-          <w:bCs/>
-          <w:color w:val="auto"/>
-          <w:sz w:val="22"/>
-          <w:szCs w:val="22"/>
-        </w:rPr>
-        <w:t xml:space="preserve">, </w:t>
-      </w:r>
-      <w:proofErr w:type="spellStart"/>
-      <w:r>
-        <w:rPr>
-          <w:rFonts w:asciiTheme="minorHAnsi" w:eastAsiaTheme="minorHAnsi" w:hAnsiTheme="minorHAnsi" w:cstheme="minorBidi"/>
-          <w:b/>
-          <w:bCs/>
-          <w:color w:val="auto"/>
-          <w:sz w:val="22"/>
-          <w:szCs w:val="22"/>
-        </w:rPr>
-        <w:t>probable</w:t>
-      </w:r>
-      <w:proofErr w:type="spellEnd"/>
-      <w:r>
-        <w:rPr>
-          <w:rFonts w:asciiTheme="minorHAnsi" w:eastAsiaTheme="minorHAnsi" w:hAnsiTheme="minorHAnsi" w:cstheme="minorBidi"/>
-          <w:b/>
-          <w:bCs/>
-          <w:color w:val="auto"/>
-          <w:sz w:val="22"/>
-          <w:szCs w:val="22"/>
-        </w:rPr>
-        <w:t xml:space="preserve">, long, </w:t>
-      </w:r>
-      <w:proofErr w:type="spellStart"/>
-      <w:r>
-        <w:rPr>
-          <w:rFonts w:asciiTheme="minorHAnsi" w:eastAsiaTheme="minorHAnsi" w:hAnsiTheme="minorHAnsi" w:cstheme="minorBidi"/>
-          <w:b/>
-          <w:bCs/>
-          <w:color w:val="auto"/>
-          <w:sz w:val="22"/>
-          <w:szCs w:val="22"/>
-        </w:rPr>
-        <w:t>lecture</w:t>
-      </w:r>
-      <w:proofErr w:type="spellEnd"/>
-      <w:r>
-        <w:rPr>
-          <w:rFonts w:asciiTheme="minorHAnsi" w:eastAsiaTheme="minorHAnsi" w:hAnsiTheme="minorHAnsi" w:cstheme="minorBidi"/>
-          <w:b/>
-          <w:bCs/>
-          <w:color w:val="auto"/>
-          <w:sz w:val="22"/>
-          <w:szCs w:val="22"/>
-        </w:rPr>
-        <w:t xml:space="preserve">, </w:t>
-      </w:r>
-      <w:proofErr w:type="spellStart"/>
-      <w:r>
-        <w:rPr>
-          <w:rFonts w:asciiTheme="minorHAnsi" w:eastAsiaTheme="minorHAnsi" w:hAnsiTheme="minorHAnsi" w:cstheme="minorBidi"/>
-          <w:b/>
-          <w:bCs/>
-          <w:color w:val="auto"/>
-          <w:sz w:val="22"/>
-          <w:szCs w:val="22"/>
-        </w:rPr>
-        <w:t>method</w:t>
-      </w:r>
-      <w:proofErr w:type="spellEnd"/>
-      <w:r>
-        <w:rPr>
-          <w:rFonts w:asciiTheme="minorHAnsi" w:eastAsiaTheme="minorHAnsi" w:hAnsiTheme="minorHAnsi" w:cstheme="minorBidi"/>
-          <w:b/>
-          <w:bCs/>
-          <w:color w:val="auto"/>
-          <w:sz w:val="22"/>
-          <w:szCs w:val="22"/>
-        </w:rPr>
-        <w:t xml:space="preserve">, </w:t>
-      </w:r>
-      <w:proofErr w:type="spellStart"/>
-      <w:r>
-        <w:rPr>
-          <w:rFonts w:asciiTheme="minorHAnsi" w:eastAsiaTheme="minorHAnsi" w:hAnsiTheme="minorHAnsi" w:cstheme="minorBidi"/>
-          <w:b/>
-          <w:bCs/>
-          <w:color w:val="auto"/>
-          <w:sz w:val="22"/>
-          <w:szCs w:val="22"/>
-        </w:rPr>
-        <w:t>disaster</w:t>
-      </w:r>
-      <w:proofErr w:type="spellEnd"/>
-      <w:r>
-        <w:rPr>
-          <w:rFonts w:asciiTheme="minorHAnsi" w:eastAsiaTheme="minorHAnsi" w:hAnsiTheme="minorHAnsi" w:cstheme="minorBidi"/>
-          <w:b/>
-          <w:bCs/>
-          <w:color w:val="auto"/>
-          <w:sz w:val="22"/>
-          <w:szCs w:val="22"/>
-        </w:rPr>
-        <w:t xml:space="preserve">, </w:t>
-      </w:r>
-      <w:proofErr w:type="spellStart"/>
-      <w:r>
-        <w:rPr>
-          <w:rFonts w:asciiTheme="minorHAnsi" w:eastAsiaTheme="minorHAnsi" w:hAnsiTheme="minorHAnsi" w:cstheme="minorBidi"/>
-          <w:b/>
-          <w:bCs/>
-          <w:color w:val="auto"/>
-          <w:sz w:val="22"/>
-          <w:szCs w:val="22"/>
-        </w:rPr>
-        <w:t>fail</w:t>
-      </w:r>
-      <w:proofErr w:type="spellEnd"/>
-      <w:r>
-        <w:rPr>
-          <w:rFonts w:asciiTheme="minorHAnsi" w:eastAsiaTheme="minorHAnsi" w:hAnsiTheme="minorHAnsi" w:cstheme="minorBidi"/>
-          <w:b/>
-          <w:bCs/>
-          <w:color w:val="auto"/>
-          <w:sz w:val="22"/>
-          <w:szCs w:val="22"/>
-        </w:rPr>
-        <w:t xml:space="preserve">, </w:t>
-      </w:r>
-      <w:proofErr w:type="spellStart"/>
-      <w:r>
-        <w:rPr>
-          <w:rFonts w:asciiTheme="minorHAnsi" w:eastAsiaTheme="minorHAnsi" w:hAnsiTheme="minorHAnsi" w:cstheme="minorBidi"/>
-          <w:b/>
-          <w:bCs/>
-          <w:color w:val="auto"/>
-          <w:sz w:val="22"/>
-          <w:szCs w:val="22"/>
-        </w:rPr>
-        <w:t>work</w:t>
-      </w:r>
-      <w:proofErr w:type="spellEnd"/>
-      <w:r>
-        <w:rPr>
-          <w:rFonts w:asciiTheme="minorHAnsi" w:eastAsiaTheme="minorHAnsi" w:hAnsiTheme="minorHAnsi" w:cstheme="minorBidi"/>
-          <w:b/>
-          <w:bCs/>
-          <w:color w:val="auto"/>
-          <w:sz w:val="22"/>
-          <w:szCs w:val="22"/>
-        </w:rPr>
-        <w:t xml:space="preserve">, </w:t>
-      </w:r>
-      <w:proofErr w:type="spellStart"/>
-      <w:r>
-        <w:rPr>
-          <w:rFonts w:asciiTheme="minorHAnsi" w:eastAsiaTheme="minorHAnsi" w:hAnsiTheme="minorHAnsi" w:cstheme="minorBidi"/>
-          <w:b/>
-          <w:bCs/>
-          <w:color w:val="auto"/>
-          <w:sz w:val="22"/>
-          <w:szCs w:val="22"/>
-        </w:rPr>
-        <w:t>advice</w:t>
-      </w:r>
-      <w:proofErr w:type="spellEnd"/>
-      <w:r>
-        <w:rPr>
-          <w:rFonts w:asciiTheme="minorHAnsi" w:eastAsiaTheme="minorHAnsi" w:hAnsiTheme="minorHAnsi" w:cstheme="minorBidi"/>
-          <w:b/>
-          <w:bCs/>
-          <w:color w:val="auto"/>
-          <w:sz w:val="22"/>
-          <w:szCs w:val="22"/>
-        </w:rPr>
-        <w:t xml:space="preserve">, idea, </w:t>
-      </w:r>
-      <w:proofErr w:type="spellStart"/>
-      <w:r>
-        <w:rPr>
-          <w:rFonts w:asciiTheme="minorHAnsi" w:eastAsiaTheme="minorHAnsi" w:hAnsiTheme="minorHAnsi" w:cstheme="minorBidi"/>
-          <w:b/>
-          <w:bCs/>
-          <w:color w:val="auto"/>
-          <w:sz w:val="22"/>
-          <w:szCs w:val="22"/>
-        </w:rPr>
-        <w:t>succeed</w:t>
-      </w:r>
-      <w:proofErr w:type="spellEnd"/>
-      <w:r>
-        <w:rPr>
-          <w:rFonts w:asciiTheme="minorHAnsi" w:eastAsiaTheme="minorHAnsi" w:hAnsiTheme="minorHAnsi" w:cstheme="minorBidi"/>
-          <w:b/>
-          <w:bCs/>
-          <w:color w:val="auto"/>
-          <w:sz w:val="22"/>
-          <w:szCs w:val="22"/>
-        </w:rPr>
-        <w:t xml:space="preserve">, </w:t>
-      </w:r>
-      <w:proofErr w:type="spellStart"/>
-      <w:r>
-        <w:rPr>
-          <w:rFonts w:asciiTheme="minorHAnsi" w:eastAsiaTheme="minorHAnsi" w:hAnsiTheme="minorHAnsi" w:cstheme="minorBidi"/>
-          <w:b/>
-          <w:bCs/>
-          <w:color w:val="auto"/>
-          <w:sz w:val="22"/>
-          <w:szCs w:val="22"/>
-        </w:rPr>
-        <w:t>easy</w:t>
-      </w:r>
-      <w:proofErr w:type="spellEnd"/>
-      <w:r>
-        <w:rPr>
-          <w:rFonts w:asciiTheme="minorHAnsi" w:eastAsiaTheme="minorHAnsi" w:hAnsiTheme="minorHAnsi" w:cstheme="minorBidi"/>
-          <w:b/>
-          <w:bCs/>
-          <w:color w:val="auto"/>
-          <w:sz w:val="22"/>
-          <w:szCs w:val="22"/>
-        </w:rPr>
-        <w:t xml:space="preserve">, </w:t>
-      </w:r>
-      <w:proofErr w:type="spellStart"/>
-      <w:r>
-        <w:rPr>
-          <w:rFonts w:asciiTheme="minorHAnsi" w:eastAsiaTheme="minorHAnsi" w:hAnsiTheme="minorHAnsi" w:cstheme="minorBidi"/>
-          <w:b/>
-          <w:bCs/>
-          <w:color w:val="auto"/>
-          <w:sz w:val="22"/>
-          <w:szCs w:val="22"/>
-        </w:rPr>
-        <w:t>is</w:t>
-      </w:r>
-      <w:proofErr w:type="spellEnd"/>
-      <w:r>
-        <w:rPr>
-          <w:rFonts w:asciiTheme="minorHAnsi" w:eastAsiaTheme="minorHAnsi" w:hAnsiTheme="minorHAnsi" w:cstheme="minorBidi"/>
-          <w:b/>
-          <w:bCs/>
-          <w:color w:val="auto"/>
-          <w:sz w:val="22"/>
-          <w:szCs w:val="22"/>
-        </w:rPr>
-        <w:t xml:space="preserve">, </w:t>
-      </w:r>
-      <w:proofErr w:type="spellStart"/>
-      <w:r>
-        <w:rPr>
-          <w:rFonts w:asciiTheme="minorHAnsi" w:eastAsiaTheme="minorHAnsi" w:hAnsiTheme="minorHAnsi" w:cstheme="minorBidi"/>
-          <w:b/>
-          <w:bCs/>
-          <w:color w:val="auto"/>
-          <w:sz w:val="22"/>
-          <w:szCs w:val="22"/>
-        </w:rPr>
-        <w:t>for</w:t>
-      </w:r>
-      <w:proofErr w:type="spellEnd"/>
-      <w:r>
-        <w:rPr>
-          <w:rFonts w:asciiTheme="minorHAnsi" w:eastAsiaTheme="minorHAnsi" w:hAnsiTheme="minorHAnsi" w:cstheme="minorBidi"/>
-          <w:b/>
-          <w:bCs/>
-          <w:color w:val="auto"/>
-          <w:sz w:val="22"/>
-          <w:szCs w:val="22"/>
-        </w:rPr>
-        <w:t xml:space="preserve">, </w:t>
-      </w:r>
-      <w:proofErr w:type="spellStart"/>
-      <w:r>
-        <w:rPr>
-          <w:rFonts w:asciiTheme="minorHAnsi" w:eastAsiaTheme="minorHAnsi" w:hAnsiTheme="minorHAnsi" w:cstheme="minorBidi"/>
-          <w:b/>
-          <w:bCs/>
-          <w:color w:val="auto"/>
-          <w:sz w:val="22"/>
-          <w:szCs w:val="22"/>
-        </w:rPr>
-        <w:t>give</w:t>
-      </w:r>
-      <w:proofErr w:type="spellEnd"/>
-      <w:r>
-        <w:rPr>
-          <w:rFonts w:asciiTheme="minorHAnsi" w:eastAsiaTheme="minorHAnsi" w:hAnsiTheme="minorHAnsi" w:cstheme="minorBidi"/>
-          <w:b/>
-          <w:bCs/>
-          <w:color w:val="auto"/>
-          <w:sz w:val="22"/>
-          <w:szCs w:val="22"/>
-        </w:rPr>
-        <w:t>.</w:t>
+        <w:t>time, prepare, solution, make, mistake, no, the, probable, long, lecture, method, disaster, fail, work, advice, idea, succeed, easy, is, for, give.</w:t>
       </w:r>
     </w:p>
     <w:p>
@@ -471,27 +74,7 @@
           <w:sz w:val="22"/>
           <w:szCs w:val="22"/>
         </w:rPr>
-        <w:t xml:space="preserve">Vámi navržený algoritmus vyzkoušejte na záznamech Signal2.txt a Signal3.txt a identifikujte slova i v těchto dvou časových řadách. V případě potřeby algoritmus dále vylepšete. Kromě metod probraných při hodinách lze pro identifikaci jednotlivých slov využít například některé další funkce, například </w:t>
-      </w:r>
-      <w:proofErr w:type="spellStart"/>
-      <w:r>
-        <w:rPr>
-          <w:rFonts w:asciiTheme="minorHAnsi" w:eastAsiaTheme="minorHAnsi" w:hAnsiTheme="minorHAnsi" w:cstheme="minorBidi"/>
-          <w:color w:val="auto"/>
-          <w:sz w:val="22"/>
-          <w:szCs w:val="22"/>
-        </w:rPr>
-        <w:t>Hammingova</w:t>
-      </w:r>
-      <w:proofErr w:type="spellEnd"/>
-      <w:r>
-        <w:rPr>
-          <w:rFonts w:asciiTheme="minorHAnsi" w:eastAsiaTheme="minorHAnsi" w:hAnsiTheme="minorHAnsi" w:cstheme="minorBidi"/>
-          <w:color w:val="auto"/>
-          <w:sz w:val="22"/>
-          <w:szCs w:val="22"/>
-        </w:rPr>
-        <w:t xml:space="preserve"> funkce nebo Hilbertova transformace, případně jakoukoli další metodu, kterou uznáte za vhodnou, vyjma metod založených na strojovém učení. </w:t>
+        <w:t xml:space="preserve">Vámi navržený algoritmus vyzkoušejte na záznamech Signal2.txt a Signal3.txt a identifikujte slova i v těchto dvou časových řadách. V případě potřeby algoritmus dále vylepšete. Kromě metod probraných při hodinách lze pro identifikaci jednotlivých slov využít například některé další funkce, například Hammingova funkce nebo Hilbertova transformace, případně jakoukoli další metodu, kterou uznáte za vhodnou, vyjma metod založených na strojovém učení. </w:t>
       </w:r>
     </w:p>
     <w:p>
@@ -529,47 +112,39 @@
     <w:p>
       <w:pPr>
         <w:jc w:val="both"/>
-        <w:rPr>
-          <w:color w:val="FF0000"/>
-        </w:rPr>
       </w:pPr>
       <w:r>
-        <w:rPr>
-          <w:color w:val="FF0000"/>
-        </w:rPr>
         <w:t xml:space="preserve">Po načtení vstupního signálu jsme využili </w:t>
       </w:r>
       <w:r>
-        <w:rPr>
-          <w:color w:val="FF0000"/>
-        </w:rPr>
         <w:t xml:space="preserve">Hilbertovu transformaci </w:t>
       </w:r>
       <w:r>
-        <w:rPr>
-          <w:color w:val="FF0000"/>
-        </w:rPr>
-        <w:t xml:space="preserve">k obalení signálu amplitudovým obalem, který jsme následně pomocí </w:t>
-      </w:r>
-      <w:proofErr w:type="spellStart"/>
-      <w:r>
-        <w:rPr>
-          <w:color w:val="FF0000"/>
-        </w:rPr>
-        <w:t>Hammingova</w:t>
-      </w:r>
-      <w:proofErr w:type="spellEnd"/>
-      <w:r>
-        <w:rPr>
-          <w:color w:val="FF0000"/>
-        </w:rPr>
-        <w:t xml:space="preserve"> okna </w:t>
+        <w:t>pomocí které jsme</w:t>
       </w:r>
       <w:r>
-        <w:rPr>
-          <w:color w:val="FF0000"/>
-        </w:rPr>
-        <w:t>rozdělili pomocí indexů na detekované slova.</w:t>
+        <w:t> obal</w:t>
+      </w:r>
+      <w:r>
+        <w:t xml:space="preserve">ili </w:t>
+      </w:r>
+      <w:r>
+        <w:t>signál</w:t>
+      </w:r>
+      <w:r>
+        <w:t xml:space="preserve"> </w:t>
+      </w:r>
+      <w:r>
+        <w:t xml:space="preserve">amplitudovým obalem, který jsme následně pomocí </w:t>
+      </w:r>
+      <w:r>
+        <w:t xml:space="preserve">Hammingova okna </w:t>
+      </w:r>
+      <w:r>
+        <w:t>vyhladili pro lepší analýzu po Fourierově transformaci</w:t>
+      </w:r>
+      <w:r>
+        <w:t>.</w:t>
       </w:r>
     </w:p>
     <w:p>
@@ -578,9 +153,9 @@
           <w:noProof/>
         </w:rPr>
         <w:drawing>
-          <wp:inline distT="0" distB="0" distL="0" distR="0" wp14:anchorId="1F0CC32F" wp14:editId="31B97F5A">
-            <wp:extent cx="5762625" cy="2876550"/>
-            <wp:effectExtent l="0" t="0" r="9525" b="0"/>
+          <wp:inline distT="0" distB="0" distL="0" distR="0" wp14:anchorId="1F0CC32F" wp14:editId="3E9D1997">
+            <wp:extent cx="5753100" cy="2876550"/>
+            <wp:effectExtent l="0" t="0" r="0" b="0"/>
             <wp:docPr id="1701708640" name="Obrázek 1"/>
             <wp:cNvGraphicFramePr>
               <a:graphicFrameLocks xmlns:a="http://schemas.openxmlformats.org/drawingml/2006/main" noChangeAspect="1"/>
@@ -589,7 +164,7 @@
               <a:graphicData uri="http://schemas.openxmlformats.org/drawingml/2006/picture">
                 <pic:pic xmlns:pic="http://schemas.openxmlformats.org/drawingml/2006/picture">
                   <pic:nvPicPr>
-                    <pic:cNvPr id="0" name="Picture 1"/>
+                    <pic:cNvPr id="1701708640" name="Obrázek 1"/>
                     <pic:cNvPicPr>
                       <a:picLocks noChangeAspect="1" noChangeArrowheads="1"/>
                     </pic:cNvPicPr>
@@ -602,7 +177,6 @@
                         </a:ext>
                       </a:extLst>
                     </a:blip>
-                    <a:srcRect/>
                     <a:stretch>
                       <a:fillRect/>
                     </a:stretch>
@@ -610,7 +184,7 @@
                   <pic:spPr bwMode="auto">
                     <a:xfrm>
                       <a:off x="0" y="0"/>
-                      <a:ext cx="5762625" cy="2876550"/>
+                      <a:ext cx="5753100" cy="2876550"/>
                     </a:xfrm>
                     <a:prstGeom prst="rect">
                       <a:avLst/>
@@ -632,45 +206,11 @@
         <w:jc w:val="both"/>
       </w:pPr>
       <w:r>
-        <w:t xml:space="preserve">Po separaci jednotlivých detekovaných slov přišla řada na porovnání spekter </w:t>
+        <w:t xml:space="preserve">Po separaci jednotlivých detekovaných slov přišla řada na porovnání spekter sigálu z databanky, kterou jsme si vytvořili pomocí balíčku gTTS (Google Text To Speech). Ten nám dle textového vstupu mp3 soubor, který jsme následně převedli na Wav soubor (balíček </w:t>
       </w:r>
-      <w:proofErr w:type="spellStart"/>
-      <w:r>
-        <w:t>sigálu</w:t>
-      </w:r>
-      <w:proofErr w:type="spellEnd"/>
-      <w:r>
-        <w:t xml:space="preserve"> z databanky, kterou jsme si vytvořili pomocí balíčku </w:t>
-      </w:r>
-      <w:proofErr w:type="spellStart"/>
-      <w:r>
-        <w:t>gTTS</w:t>
-      </w:r>
-      <w:proofErr w:type="spellEnd"/>
-      <w:r>
-        <w:t xml:space="preserve"> (Google Text To </w:t>
-      </w:r>
-      <w:proofErr w:type="spellStart"/>
-      <w:r>
-        <w:t>Speech</w:t>
-      </w:r>
-      <w:proofErr w:type="spellEnd"/>
-      <w:r>
-        <w:t xml:space="preserve">). Ten nám dle textového vstupu mp3 soubor, který jsme následně převedli na </w:t>
-      </w:r>
-      <w:proofErr w:type="spellStart"/>
-      <w:r>
-        <w:t>Wav</w:t>
-      </w:r>
-      <w:proofErr w:type="spellEnd"/>
-      <w:r>
-        <w:t xml:space="preserve"> soubor (balíček </w:t>
-      </w:r>
-      <w:proofErr w:type="spellStart"/>
       <w:r>
         <w:t>moviepy</w:t>
       </w:r>
-      <w:proofErr w:type="spellEnd"/>
       <w:r>
         <w:t>), který jsme převedli do textového souboru.</w:t>
       </w:r>
@@ -703,15 +243,7 @@
         <w:t xml:space="preserve">A </w:t>
       </w:r>
       <w:r>
-        <w:t>(</w:t>
-      </w:r>
-      <w:proofErr w:type="spellStart"/>
-      <w:r>
-        <w:t>One</w:t>
-      </w:r>
-      <w:proofErr w:type="spellEnd"/>
-      <w:r>
-        <w:t xml:space="preserve"> VS All)</w:t>
+        <w:t>(One VS All)</w:t>
       </w:r>
       <w:r>
         <w:rPr>
@@ -724,13 +256,11 @@
         <w:t xml:space="preserve">porovnali </w:t>
       </w:r>
       <w:r>
-        <w:t xml:space="preserve">pomocí korelace s jednotlivými spektry frekvencí z databanky. Následně </w:t>
+        <w:t>pomocí korelace s jednotlivými spektry frekvencí z databanky. Následně js</w:t>
       </w:r>
-      <w:proofErr w:type="gramStart"/>
       <w:r>
-        <w:t>jsem</w:t>
+        <w:t>me</w:t>
       </w:r>
-      <w:proofErr w:type="gramEnd"/>
       <w:r>
         <w:t xml:space="preserve"> přiřadili příslušné slovo pomocí maximální hodnoty korelace.</w:t>
       </w:r>
@@ -764,7 +294,6 @@
                 <w:bCs/>
               </w:rPr>
             </w:pPr>
-            <w:proofErr w:type="spellStart"/>
             <w:r>
               <w:rPr>
                 <w:b/>
@@ -772,7 +301,6 @@
               </w:rPr>
               <w:t>Sample_i</w:t>
             </w:r>
-            <w:proofErr w:type="spellEnd"/>
           </w:p>
         </w:tc>
         <w:tc>
@@ -789,7 +317,6 @@
                 <w:bCs/>
               </w:rPr>
             </w:pPr>
-            <w:proofErr w:type="spellStart"/>
             <w:r>
               <w:rPr>
                 <w:b/>
@@ -797,7 +324,6 @@
               </w:rPr>
               <w:t>Sample_j</w:t>
             </w:r>
-            <w:proofErr w:type="spellEnd"/>
           </w:p>
         </w:tc>
         <w:tc>
@@ -814,7 +340,6 @@
                 <w:bCs/>
               </w:rPr>
             </w:pPr>
-            <w:proofErr w:type="spellStart"/>
             <w:r>
               <w:rPr>
                 <w:b/>
@@ -822,7 +347,6 @@
               </w:rPr>
               <w:t>Correlation</w:t>
             </w:r>
-            <w:proofErr w:type="spellEnd"/>
           </w:p>
         </w:tc>
       </w:tr>
@@ -839,8 +363,14 @@
           <w:p>
             <w:pPr>
               <w:jc w:val="both"/>
-            </w:pPr>
-            <w:r>
+              <w:rPr>
+                <w:color w:val="FF0000"/>
+              </w:rPr>
+            </w:pPr>
+            <w:r>
+              <w:rPr>
+                <w:color w:val="FF0000"/>
+              </w:rPr>
               <w:t>0</w:t>
             </w:r>
           </w:p>
@@ -854,8 +384,14 @@
           <w:p>
             <w:pPr>
               <w:jc w:val="both"/>
-            </w:pPr>
-            <w:r>
+              <w:rPr>
+                <w:color w:val="FF0000"/>
+              </w:rPr>
+            </w:pPr>
+            <w:r>
+              <w:rPr>
+                <w:color w:val="FF0000"/>
+              </w:rPr>
               <w:t>time.txt</w:t>
             </w:r>
           </w:p>
@@ -869,8 +405,14 @@
           <w:p>
             <w:pPr>
               <w:jc w:val="both"/>
-            </w:pPr>
-            <w:r>
+              <w:rPr>
+                <w:color w:val="FF0000"/>
+              </w:rPr>
+            </w:pPr>
+            <w:r>
+              <w:rPr>
+                <w:color w:val="FF0000"/>
+              </w:rPr>
               <w:t>5668595140863.4931640625</w:t>
             </w:r>
           </w:p>
@@ -889,8 +431,14 @@
           <w:p>
             <w:pPr>
               <w:jc w:val="both"/>
-            </w:pPr>
-            <w:r>
+              <w:rPr>
+                <w:color w:val="FF0000"/>
+              </w:rPr>
+            </w:pPr>
+            <w:r>
+              <w:rPr>
+                <w:color w:val="FF0000"/>
+              </w:rPr>
               <w:t>1</w:t>
             </w:r>
           </w:p>
@@ -904,8 +452,14 @@
           <w:p>
             <w:pPr>
               <w:jc w:val="both"/>
-            </w:pPr>
-            <w:r>
+              <w:rPr>
+                <w:color w:val="FF0000"/>
+              </w:rPr>
+            </w:pPr>
+            <w:r>
+              <w:rPr>
+                <w:color w:val="FF0000"/>
+              </w:rPr>
               <w:t>solution.txt</w:t>
             </w:r>
           </w:p>
@@ -919,8 +473,14 @@
           <w:p>
             <w:pPr>
               <w:jc w:val="both"/>
-            </w:pPr>
-            <w:r>
+              <w:rPr>
+                <w:color w:val="FF0000"/>
+              </w:rPr>
+            </w:pPr>
+            <w:r>
+              <w:rPr>
+                <w:color w:val="FF0000"/>
+              </w:rPr>
               <w:t>19798276288376.20703125</w:t>
             </w:r>
           </w:p>
@@ -939,8 +499,14 @@
           <w:p>
             <w:pPr>
               <w:jc w:val="both"/>
-            </w:pPr>
-            <w:r>
+              <w:rPr>
+                <w:color w:val="FF0000"/>
+              </w:rPr>
+            </w:pPr>
+            <w:r>
+              <w:rPr>
+                <w:color w:val="FF0000"/>
+              </w:rPr>
               <w:t>2</w:t>
             </w:r>
           </w:p>
@@ -954,8 +520,14 @@
           <w:p>
             <w:pPr>
               <w:jc w:val="both"/>
-            </w:pPr>
-            <w:r>
+              <w:rPr>
+                <w:color w:val="FF0000"/>
+              </w:rPr>
+            </w:pPr>
+            <w:r>
+              <w:rPr>
+                <w:color w:val="FF0000"/>
+              </w:rPr>
               <w:t>fail.txt</w:t>
             </w:r>
           </w:p>
@@ -969,8 +541,14 @@
           <w:p>
             <w:pPr>
               <w:jc w:val="both"/>
-            </w:pPr>
-            <w:r>
+              <w:rPr>
+                <w:color w:val="FF0000"/>
+              </w:rPr>
+            </w:pPr>
+            <w:r>
+              <w:rPr>
+                <w:color w:val="FF0000"/>
+              </w:rPr>
               <w:t>929497.46769228228367865085601806640625</w:t>
             </w:r>
           </w:p>
@@ -989,8 +567,14 @@
           <w:p>
             <w:pPr>
               <w:jc w:val="both"/>
-            </w:pPr>
-            <w:r>
+              <w:rPr>
+                <w:color w:val="FF0000"/>
+              </w:rPr>
+            </w:pPr>
+            <w:r>
+              <w:rPr>
+                <w:color w:val="FF0000"/>
+              </w:rPr>
               <w:t>3</w:t>
             </w:r>
           </w:p>
@@ -1004,8 +588,14 @@
           <w:p>
             <w:pPr>
               <w:jc w:val="both"/>
-            </w:pPr>
-            <w:r>
+              <w:rPr>
+                <w:color w:val="FF0000"/>
+              </w:rPr>
+            </w:pPr>
+            <w:r>
+              <w:rPr>
+                <w:color w:val="FF0000"/>
+              </w:rPr>
               <w:t>fail.txt</w:t>
             </w:r>
           </w:p>
@@ -1019,8 +609,14 @@
           <w:p>
             <w:pPr>
               <w:jc w:val="both"/>
-            </w:pPr>
-            <w:r>
+              <w:rPr>
+                <w:color w:val="FF0000"/>
+              </w:rPr>
+            </w:pPr>
+            <w:r>
+              <w:rPr>
+                <w:color w:val="FF0000"/>
+              </w:rPr>
               <w:t>3024189.5316199013032019138336181640625</w:t>
             </w:r>
           </w:p>
@@ -1039,8 +635,14 @@
           <w:p>
             <w:pPr>
               <w:jc w:val="both"/>
-            </w:pPr>
-            <w:r>
+              <w:rPr>
+                <w:color w:val="FF0000"/>
+              </w:rPr>
+            </w:pPr>
+            <w:r>
+              <w:rPr>
+                <w:color w:val="FF0000"/>
+              </w:rPr>
               <w:t>4</w:t>
             </w:r>
           </w:p>
@@ -1054,8 +656,14 @@
           <w:p>
             <w:pPr>
               <w:jc w:val="both"/>
-            </w:pPr>
-            <w:r>
+              <w:rPr>
+                <w:color w:val="FF0000"/>
+              </w:rPr>
+            </w:pPr>
+            <w:r>
+              <w:rPr>
+                <w:color w:val="FF0000"/>
+              </w:rPr>
               <w:t>lecture.txt</w:t>
             </w:r>
           </w:p>
@@ -1069,8 +677,14 @@
           <w:p>
             <w:pPr>
               <w:jc w:val="both"/>
-            </w:pPr>
-            <w:r>
+              <w:rPr>
+                <w:color w:val="FF0000"/>
+              </w:rPr>
+            </w:pPr>
+            <w:r>
+              <w:rPr>
+                <w:color w:val="FF0000"/>
+              </w:rPr>
               <w:t>19456339563693.12890625</w:t>
             </w:r>
           </w:p>
@@ -1089,8 +703,14 @@
           <w:p>
             <w:pPr>
               <w:jc w:val="both"/>
-            </w:pPr>
-            <w:r>
+              <w:rPr>
+                <w:color w:val="FF0000"/>
+              </w:rPr>
+            </w:pPr>
+            <w:r>
+              <w:rPr>
+                <w:color w:val="FF0000"/>
+              </w:rPr>
               <w:t>5</w:t>
             </w:r>
           </w:p>
@@ -1104,8 +724,14 @@
           <w:p>
             <w:pPr>
               <w:jc w:val="both"/>
-            </w:pPr>
-            <w:r>
+              <w:rPr>
+                <w:color w:val="FF0000"/>
+              </w:rPr>
+            </w:pPr>
+            <w:r>
+              <w:rPr>
+                <w:color w:val="FF0000"/>
+              </w:rPr>
               <w:t>disaster.txt</w:t>
             </w:r>
           </w:p>
@@ -1119,8 +745,14 @@
           <w:p>
             <w:pPr>
               <w:jc w:val="both"/>
-            </w:pPr>
-            <w:r>
+              <w:rPr>
+                <w:color w:val="FF0000"/>
+              </w:rPr>
+            </w:pPr>
+            <w:r>
+              <w:rPr>
+                <w:color w:val="FF0000"/>
+              </w:rPr>
               <w:t>10287518967515.71875</w:t>
             </w:r>
           </w:p>
@@ -1139,8 +771,14 @@
           <w:p>
             <w:pPr>
               <w:jc w:val="both"/>
-            </w:pPr>
-            <w:r>
+              <w:rPr>
+                <w:color w:val="FF0000"/>
+              </w:rPr>
+            </w:pPr>
+            <w:r>
+              <w:rPr>
+                <w:color w:val="FF0000"/>
+              </w:rPr>
               <w:t>6</w:t>
             </w:r>
           </w:p>
@@ -1154,8 +792,14 @@
           <w:p>
             <w:pPr>
               <w:jc w:val="both"/>
-            </w:pPr>
-            <w:r>
+              <w:rPr>
+                <w:color w:val="FF0000"/>
+              </w:rPr>
+            </w:pPr>
+            <w:r>
+              <w:rPr>
+                <w:color w:val="FF0000"/>
+              </w:rPr>
               <w:t>work.txt</w:t>
             </w:r>
           </w:p>
@@ -1169,8 +813,14 @@
           <w:p>
             <w:pPr>
               <w:jc w:val="both"/>
-            </w:pPr>
-            <w:r>
+              <w:rPr>
+                <w:color w:val="FF0000"/>
+              </w:rPr>
+            </w:pPr>
+            <w:r>
+              <w:rPr>
+                <w:color w:val="FF0000"/>
+              </w:rPr>
               <w:t>18701498341004.59765625</w:t>
             </w:r>
           </w:p>
@@ -1189,8 +839,14 @@
           <w:p>
             <w:pPr>
               <w:jc w:val="both"/>
-            </w:pPr>
-            <w:r>
+              <w:rPr>
+                <w:color w:val="FF0000"/>
+              </w:rPr>
+            </w:pPr>
+            <w:r>
+              <w:rPr>
+                <w:color w:val="FF0000"/>
+              </w:rPr>
               <w:t>7</w:t>
             </w:r>
           </w:p>
@@ -1204,8 +860,14 @@
           <w:p>
             <w:pPr>
               <w:jc w:val="both"/>
-            </w:pPr>
-            <w:r>
+              <w:rPr>
+                <w:color w:val="FF0000"/>
+              </w:rPr>
+            </w:pPr>
+            <w:r>
+              <w:rPr>
+                <w:color w:val="FF0000"/>
+              </w:rPr>
               <w:t>prepare.txt</w:t>
             </w:r>
           </w:p>
@@ -1219,8 +881,14 @@
           <w:p>
             <w:pPr>
               <w:jc w:val="both"/>
-            </w:pPr>
-            <w:r>
+              <w:rPr>
+                <w:color w:val="FF0000"/>
+              </w:rPr>
+            </w:pPr>
+            <w:r>
+              <w:rPr>
+                <w:color w:val="FF0000"/>
+              </w:rPr>
               <w:t>22421371131437.34765625</w:t>
             </w:r>
           </w:p>
@@ -1239,8 +907,14 @@
           <w:p>
             <w:pPr>
               <w:jc w:val="both"/>
-            </w:pPr>
-            <w:r>
+              <w:rPr>
+                <w:color w:val="FF0000"/>
+              </w:rPr>
+            </w:pPr>
+            <w:r>
+              <w:rPr>
+                <w:color w:val="FF0000"/>
+              </w:rPr>
               <w:t>8</w:t>
             </w:r>
           </w:p>
@@ -1254,8 +928,14 @@
           <w:p>
             <w:pPr>
               <w:jc w:val="both"/>
-            </w:pPr>
-            <w:r>
+              <w:rPr>
+                <w:color w:val="FF0000"/>
+              </w:rPr>
+            </w:pPr>
+            <w:r>
+              <w:rPr>
+                <w:color w:val="FF0000"/>
+              </w:rPr>
               <w:t>make.txt</w:t>
             </w:r>
           </w:p>
@@ -1269,8 +949,14 @@
           <w:p>
             <w:pPr>
               <w:jc w:val="both"/>
-            </w:pPr>
-            <w:r>
+              <w:rPr>
+                <w:color w:val="FF0000"/>
+              </w:rPr>
+            </w:pPr>
+            <w:r>
+              <w:rPr>
+                <w:color w:val="FF0000"/>
+              </w:rPr>
               <w:t>13716614592013.673828125</w:t>
             </w:r>
           </w:p>
@@ -1289,8 +975,14 @@
           <w:p>
             <w:pPr>
               <w:jc w:val="both"/>
-            </w:pPr>
-            <w:r>
+              <w:rPr>
+                <w:color w:val="FF0000"/>
+              </w:rPr>
+            </w:pPr>
+            <w:r>
+              <w:rPr>
+                <w:color w:val="FF0000"/>
+              </w:rPr>
               <w:t>9</w:t>
             </w:r>
           </w:p>
@@ -1304,8 +996,14 @@
           <w:p>
             <w:pPr>
               <w:jc w:val="both"/>
-            </w:pPr>
-            <w:r>
+              <w:rPr>
+                <w:color w:val="FF0000"/>
+              </w:rPr>
+            </w:pPr>
+            <w:r>
+              <w:rPr>
+                <w:color w:val="FF0000"/>
+              </w:rPr>
               <w:t>prepare.txt</w:t>
             </w:r>
           </w:p>
@@ -1319,8 +1017,14 @@
           <w:p>
             <w:pPr>
               <w:jc w:val="both"/>
-            </w:pPr>
-            <w:r>
+              <w:rPr>
+                <w:color w:val="FF0000"/>
+              </w:rPr>
+            </w:pPr>
+            <w:r>
+              <w:rPr>
+                <w:color w:val="FF0000"/>
+              </w:rPr>
               <w:t>38672163181555.0234375</w:t>
             </w:r>
           </w:p>
@@ -1339,8 +1043,14 @@
           <w:p>
             <w:pPr>
               <w:jc w:val="both"/>
-            </w:pPr>
-            <w:r>
+              <w:rPr>
+                <w:color w:val="FF0000"/>
+              </w:rPr>
+            </w:pPr>
+            <w:r>
+              <w:rPr>
+                <w:color w:val="FF0000"/>
+              </w:rPr>
               <w:t>10</w:t>
             </w:r>
           </w:p>
@@ -1354,8 +1064,14 @@
           <w:p>
             <w:pPr>
               <w:jc w:val="both"/>
-            </w:pPr>
-            <w:r>
+              <w:rPr>
+                <w:color w:val="FF0000"/>
+              </w:rPr>
+            </w:pPr>
+            <w:r>
+              <w:rPr>
+                <w:color w:val="FF0000"/>
+              </w:rPr>
               <w:t>succeed.txt</w:t>
             </w:r>
           </w:p>
@@ -1369,8 +1085,14 @@
           <w:p>
             <w:pPr>
               <w:jc w:val="both"/>
-            </w:pPr>
-            <w:r>
+              <w:rPr>
+                <w:color w:val="FF0000"/>
+              </w:rPr>
+            </w:pPr>
+            <w:r>
+              <w:rPr>
+                <w:color w:val="FF0000"/>
+              </w:rPr>
               <w:t>74680586061432.21875</w:t>
             </w:r>
           </w:p>
@@ -1391,9 +1113,9 @@
           <w:noProof/>
         </w:rPr>
         <w:drawing>
-          <wp:inline distT="0" distB="0" distL="0" distR="0" wp14:anchorId="348298E5" wp14:editId="4934E5AC">
-            <wp:extent cx="5762625" cy="2876550"/>
-            <wp:effectExtent l="0" t="0" r="9525" b="0"/>
+          <wp:inline distT="0" distB="0" distL="0" distR="0" wp14:anchorId="348298E5" wp14:editId="06A382B5">
+            <wp:extent cx="5753100" cy="2876550"/>
+            <wp:effectExtent l="0" t="0" r="0" b="0"/>
             <wp:docPr id="800606516" name="Obrázek 8"/>
             <wp:cNvGraphicFramePr>
               <a:graphicFrameLocks xmlns:a="http://schemas.openxmlformats.org/drawingml/2006/main" noChangeAspect="1"/>
@@ -1402,7 +1124,7 @@
               <a:graphicData uri="http://schemas.openxmlformats.org/drawingml/2006/picture">
                 <pic:pic xmlns:pic="http://schemas.openxmlformats.org/drawingml/2006/picture">
                   <pic:nvPicPr>
-                    <pic:cNvPr id="0" name="Picture 13"/>
+                    <pic:cNvPr id="800606516" name="Obrázek 8"/>
                     <pic:cNvPicPr>
                       <a:picLocks noChangeAspect="1" noChangeArrowheads="1"/>
                     </pic:cNvPicPr>
@@ -1415,7 +1137,6 @@
                         </a:ext>
                       </a:extLst>
                     </a:blip>
-                    <a:srcRect/>
                     <a:stretch>
                       <a:fillRect/>
                     </a:stretch>
@@ -1423,7 +1144,7 @@
                   <pic:spPr bwMode="auto">
                     <a:xfrm>
                       <a:off x="0" y="0"/>
-                      <a:ext cx="5762625" cy="2876550"/>
+                      <a:ext cx="5753100" cy="2876550"/>
                     </a:xfrm>
                     <a:prstGeom prst="rect">
                       <a:avLst/>
@@ -1452,7 +1173,7 @@
           <w:noProof/>
         </w:rPr>
         <w:drawing>
-          <wp:anchor distT="0" distB="0" distL="114300" distR="114300" simplePos="0" relativeHeight="251658240" behindDoc="0" locked="0" layoutInCell="1" allowOverlap="1" wp14:anchorId="57CBFDAF" wp14:editId="50AEF3AE">
+          <wp:anchor distT="0" distB="0" distL="114300" distR="114300" simplePos="0" relativeHeight="251658240" behindDoc="0" locked="0" layoutInCell="1" allowOverlap="1" wp14:anchorId="57CBFDAF" wp14:editId="22AF5E3C">
             <wp:simplePos x="0" y="0"/>
             <wp:positionH relativeFrom="margin">
               <wp:align>left</wp:align>
@@ -1460,8 +1181,8 @@
             <wp:positionV relativeFrom="paragraph">
               <wp:posOffset>122555</wp:posOffset>
             </wp:positionV>
-            <wp:extent cx="5762625" cy="2876550"/>
-            <wp:effectExtent l="0" t="0" r="9525" b="0"/>
+            <wp:extent cx="5753100" cy="2876550"/>
+            <wp:effectExtent l="0" t="0" r="0" b="0"/>
             <wp:wrapNone/>
             <wp:docPr id="18549545" name="Obrázek 7"/>
             <wp:cNvGraphicFramePr>
@@ -1471,7 +1192,7 @@
               <a:graphicData uri="http://schemas.openxmlformats.org/drawingml/2006/picture">
                 <pic:pic xmlns:pic="http://schemas.openxmlformats.org/drawingml/2006/picture">
                   <pic:nvPicPr>
-                    <pic:cNvPr id="0" name="Picture 12"/>
+                    <pic:cNvPr id="18549545" name="Obrázek 7"/>
                     <pic:cNvPicPr>
                       <a:picLocks noChangeAspect="1" noChangeArrowheads="1"/>
                     </pic:cNvPicPr>
@@ -1484,7 +1205,6 @@
                         </a:ext>
                       </a:extLst>
                     </a:blip>
-                    <a:srcRect/>
                     <a:stretch>
                       <a:fillRect/>
                     </a:stretch>
@@ -1492,7 +1212,7 @@
                   <pic:spPr bwMode="auto">
                     <a:xfrm>
                       <a:off x="0" y="0"/>
-                      <a:ext cx="5762625" cy="2876550"/>
+                      <a:ext cx="5753100" cy="2876550"/>
                     </a:xfrm>
                     <a:prstGeom prst="rect">
                       <a:avLst/>
@@ -1505,6 +1225,9 @@
                 </pic:pic>
               </a:graphicData>
             </a:graphic>
+            <wp14:sizeRelH relativeFrom="margin">
+              <wp14:pctWidth>0</wp14:pctWidth>
+            </wp14:sizeRelH>
           </wp:anchor>
         </w:drawing>
       </w:r>
@@ -1570,10 +1293,10 @@
           <w:noProof/>
         </w:rPr>
         <w:drawing>
-          <wp:inline distT="0" distB="0" distL="0" distR="0" wp14:anchorId="312B80E5" wp14:editId="75B9F43B">
-            <wp:extent cx="5760720" cy="3456305"/>
+          <wp:inline distT="0" distB="0" distL="0" distR="0" wp14:anchorId="312B80E5" wp14:editId="0371A648">
+            <wp:extent cx="5760508" cy="3456305"/>
             <wp:effectExtent l="0" t="0" r="0" b="0"/>
-            <wp:docPr id="1128018665" name="Obrázek 4" descr="Obsah obrázku text, snímek obrazovky, Vykreslený graf, diagram&#10;&#10;Popis byl vytvořen automaticky"/>
+            <wp:docPr id="1128018665" name="Obrázek 4"/>
             <wp:cNvGraphicFramePr>
               <a:graphicFrameLocks xmlns:a="http://schemas.openxmlformats.org/drawingml/2006/main" noChangeAspect="1"/>
             </wp:cNvGraphicFramePr>
@@ -1581,7 +1304,7 @@
               <a:graphicData uri="http://schemas.openxmlformats.org/drawingml/2006/picture">
                 <pic:pic xmlns:pic="http://schemas.openxmlformats.org/drawingml/2006/picture">
                   <pic:nvPicPr>
-                    <pic:cNvPr id="1128018665" name="Obrázek 4" descr="Obsah obrázku text, snímek obrazovky, Vykreslený graf, diagram&#10;&#10;Popis byl vytvořen automaticky"/>
+                    <pic:cNvPr id="1128018665" name="Obrázek 4"/>
                     <pic:cNvPicPr>
                       <a:picLocks noChangeAspect="1" noChangeArrowheads="1"/>
                     </pic:cNvPicPr>
@@ -1594,7 +1317,6 @@
                         </a:ext>
                       </a:extLst>
                     </a:blip>
-                    <a:srcRect/>
                     <a:stretch>
                       <a:fillRect/>
                     </a:stretch>
@@ -1602,7 +1324,7 @@
                   <pic:spPr bwMode="auto">
                     <a:xfrm>
                       <a:off x="0" y="0"/>
-                      <a:ext cx="5760720" cy="3456305"/>
+                      <a:ext cx="5760508" cy="3456305"/>
                     </a:xfrm>
                     <a:prstGeom prst="rect">
                       <a:avLst/>
@@ -1673,7 +1395,6 @@
                 <w:bCs/>
               </w:rPr>
             </w:pPr>
-            <w:proofErr w:type="spellStart"/>
             <w:r>
               <w:rPr>
                 <w:b/>
@@ -1682,7 +1403,6 @@
               <w:lastRenderedPageBreak/>
               <w:t>Sample_i</w:t>
             </w:r>
-            <w:proofErr w:type="spellEnd"/>
           </w:p>
         </w:tc>
         <w:tc>
@@ -1699,7 +1419,6 @@
                 <w:bCs/>
               </w:rPr>
             </w:pPr>
-            <w:proofErr w:type="spellStart"/>
             <w:r>
               <w:rPr>
                 <w:b/>
@@ -1707,7 +1426,6 @@
               </w:rPr>
               <w:t>Sample_j</w:t>
             </w:r>
-            <w:proofErr w:type="spellEnd"/>
           </w:p>
         </w:tc>
         <w:tc>
@@ -1724,7 +1442,6 @@
                 <w:bCs/>
               </w:rPr>
             </w:pPr>
-            <w:proofErr w:type="spellStart"/>
             <w:r>
               <w:rPr>
                 <w:b/>
@@ -1732,7 +1449,6 @@
               </w:rPr>
               <w:t>Correlation</w:t>
             </w:r>
-            <w:proofErr w:type="spellEnd"/>
           </w:p>
         </w:tc>
       </w:tr>
@@ -1749,8 +1465,14 @@
           <w:p>
             <w:pPr>
               <w:jc w:val="both"/>
-            </w:pPr>
-            <w:r>
+              <w:rPr>
+                <w:color w:val="FF0000"/>
+              </w:rPr>
+            </w:pPr>
+            <w:r>
+              <w:rPr>
+                <w:color w:val="FF0000"/>
+              </w:rPr>
               <w:t>0</w:t>
             </w:r>
           </w:p>
@@ -1764,8 +1486,14 @@
           <w:p>
             <w:pPr>
               <w:jc w:val="both"/>
-            </w:pPr>
-            <w:r>
+              <w:rPr>
+                <w:color w:val="FF0000"/>
+              </w:rPr>
+            </w:pPr>
+            <w:r>
+              <w:rPr>
+                <w:color w:val="FF0000"/>
+              </w:rPr>
               <w:t>advice.txt</w:t>
             </w:r>
           </w:p>
@@ -1779,8 +1507,14 @@
           <w:p>
             <w:pPr>
               <w:jc w:val="both"/>
-            </w:pPr>
-            <w:r>
+              <w:rPr>
+                <w:color w:val="FF0000"/>
+              </w:rPr>
+            </w:pPr>
+            <w:r>
+              <w:rPr>
+                <w:color w:val="FF0000"/>
+              </w:rPr>
               <w:t>3018425468865.60009765625</w:t>
             </w:r>
           </w:p>
@@ -1799,8 +1533,14 @@
           <w:p>
             <w:pPr>
               <w:jc w:val="both"/>
-            </w:pPr>
-            <w:r>
+              <w:rPr>
+                <w:color w:val="FF0000"/>
+              </w:rPr>
+            </w:pPr>
+            <w:r>
+              <w:rPr>
+                <w:color w:val="FF0000"/>
+              </w:rPr>
               <w:t>0</w:t>
             </w:r>
           </w:p>
@@ -1814,8 +1554,14 @@
           <w:p>
             <w:pPr>
               <w:jc w:val="both"/>
-            </w:pPr>
-            <w:r>
+              <w:rPr>
+                <w:color w:val="FF0000"/>
+              </w:rPr>
+            </w:pPr>
+            <w:r>
+              <w:rPr>
+                <w:color w:val="FF0000"/>
+              </w:rPr>
               <w:t>disaster.txt</w:t>
             </w:r>
           </w:p>
@@ -1829,8 +1575,14 @@
           <w:p>
             <w:pPr>
               <w:jc w:val="both"/>
-            </w:pPr>
-            <w:r>
+              <w:rPr>
+                <w:color w:val="FF0000"/>
+              </w:rPr>
+            </w:pPr>
+            <w:r>
+              <w:rPr>
+                <w:color w:val="FF0000"/>
+              </w:rPr>
               <w:t>2496774661987.17578125</w:t>
             </w:r>
           </w:p>
@@ -1849,8 +1601,14 @@
           <w:p>
             <w:pPr>
               <w:jc w:val="both"/>
-            </w:pPr>
-            <w:r>
+              <w:rPr>
+                <w:color w:val="FF0000"/>
+              </w:rPr>
+            </w:pPr>
+            <w:r>
+              <w:rPr>
+                <w:color w:val="FF0000"/>
+              </w:rPr>
               <w:t>0</w:t>
             </w:r>
           </w:p>
@@ -1864,8 +1622,14 @@
           <w:p>
             <w:pPr>
               <w:jc w:val="both"/>
-            </w:pPr>
-            <w:r>
+              <w:rPr>
+                <w:color w:val="FF0000"/>
+              </w:rPr>
+            </w:pPr>
+            <w:r>
+              <w:rPr>
+                <w:color w:val="FF0000"/>
+              </w:rPr>
               <w:t>easy.txt</w:t>
             </w:r>
           </w:p>
@@ -1879,8 +1643,14 @@
           <w:p>
             <w:pPr>
               <w:jc w:val="both"/>
-            </w:pPr>
-            <w:r>
+              <w:rPr>
+                <w:color w:val="FF0000"/>
+              </w:rPr>
+            </w:pPr>
+            <w:r>
+              <w:rPr>
+                <w:color w:val="FF0000"/>
+              </w:rPr>
               <w:t>1747133581303.197509765625</w:t>
             </w:r>
           </w:p>
@@ -1899,8 +1669,14 @@
           <w:p>
             <w:pPr>
               <w:jc w:val="both"/>
-            </w:pPr>
-            <w:r>
+              <w:rPr>
+                <w:color w:val="FF0000"/>
+              </w:rPr>
+            </w:pPr>
+            <w:r>
+              <w:rPr>
+                <w:color w:val="FF0000"/>
+              </w:rPr>
               <w:t>0</w:t>
             </w:r>
           </w:p>
@@ -1914,8 +1690,14 @@
           <w:p>
             <w:pPr>
               <w:jc w:val="both"/>
-            </w:pPr>
-            <w:r>
+              <w:rPr>
+                <w:color w:val="FF0000"/>
+              </w:rPr>
+            </w:pPr>
+            <w:r>
+              <w:rPr>
+                <w:color w:val="FF0000"/>
+              </w:rPr>
               <w:t>fail.txt</w:t>
             </w:r>
           </w:p>
@@ -1929,8 +1711,14 @@
           <w:p>
             <w:pPr>
               <w:jc w:val="both"/>
-            </w:pPr>
-            <w:r>
+              <w:rPr>
+                <w:color w:val="FF0000"/>
+              </w:rPr>
+            </w:pPr>
+            <w:r>
+              <w:rPr>
+                <w:color w:val="FF0000"/>
+              </w:rPr>
               <w:t>3632364550872.21240234375</w:t>
             </w:r>
           </w:p>
@@ -1949,8 +1737,14 @@
           <w:p>
             <w:pPr>
               <w:jc w:val="both"/>
-            </w:pPr>
-            <w:r>
+              <w:rPr>
+                <w:color w:val="FF0000"/>
+              </w:rPr>
+            </w:pPr>
+            <w:r>
+              <w:rPr>
+                <w:color w:val="FF0000"/>
+              </w:rPr>
               <w:t>0</w:t>
             </w:r>
           </w:p>
@@ -1964,8 +1758,14 @@
           <w:p>
             <w:pPr>
               <w:jc w:val="both"/>
-            </w:pPr>
-            <w:r>
+              <w:rPr>
+                <w:color w:val="FF0000"/>
+              </w:rPr>
+            </w:pPr>
+            <w:r>
+              <w:rPr>
+                <w:color w:val="FF0000"/>
+              </w:rPr>
               <w:t>for.txt</w:t>
             </w:r>
           </w:p>
@@ -1979,8 +1779,14 @@
           <w:p>
             <w:pPr>
               <w:jc w:val="both"/>
-            </w:pPr>
-            <w:r>
+              <w:rPr>
+                <w:color w:val="FF0000"/>
+              </w:rPr>
+            </w:pPr>
+            <w:r>
+              <w:rPr>
+                <w:color w:val="FF0000"/>
+              </w:rPr>
               <w:t>4679446357056.8828125</w:t>
             </w:r>
           </w:p>
@@ -1999,8 +1805,14 @@
           <w:p>
             <w:pPr>
               <w:jc w:val="both"/>
-            </w:pPr>
-            <w:r>
+              <w:rPr>
+                <w:color w:val="FF0000"/>
+              </w:rPr>
+            </w:pPr>
+            <w:r>
+              <w:rPr>
+                <w:color w:val="FF0000"/>
+              </w:rPr>
               <w:t>0</w:t>
             </w:r>
           </w:p>
@@ -2014,8 +1826,14 @@
           <w:p>
             <w:pPr>
               <w:jc w:val="both"/>
-            </w:pPr>
-            <w:r>
+              <w:rPr>
+                <w:color w:val="FF0000"/>
+              </w:rPr>
+            </w:pPr>
+            <w:r>
+              <w:rPr>
+                <w:color w:val="FF0000"/>
+              </w:rPr>
               <w:t>give.txt</w:t>
             </w:r>
           </w:p>
@@ -2029,8 +1847,14 @@
           <w:p>
             <w:pPr>
               <w:jc w:val="both"/>
-            </w:pPr>
-            <w:r>
+              <w:rPr>
+                <w:color w:val="FF0000"/>
+              </w:rPr>
+            </w:pPr>
+            <w:r>
+              <w:rPr>
+                <w:color w:val="FF0000"/>
+              </w:rPr>
               <w:t>396328004697.816650390625</w:t>
             </w:r>
           </w:p>
@@ -2049,8 +1873,14 @@
           <w:p>
             <w:pPr>
               <w:jc w:val="both"/>
-            </w:pPr>
-            <w:r>
+              <w:rPr>
+                <w:color w:val="FF0000"/>
+              </w:rPr>
+            </w:pPr>
+            <w:r>
+              <w:rPr>
+                <w:color w:val="FF0000"/>
+              </w:rPr>
               <w:t>0</w:t>
             </w:r>
           </w:p>
@@ -2064,8 +1894,14 @@
           <w:p>
             <w:pPr>
               <w:jc w:val="both"/>
-            </w:pPr>
-            <w:r>
+              <w:rPr>
+                <w:color w:val="FF0000"/>
+              </w:rPr>
+            </w:pPr>
+            <w:r>
+              <w:rPr>
+                <w:color w:val="FF0000"/>
+              </w:rPr>
               <w:t>idea.txt</w:t>
             </w:r>
           </w:p>
@@ -2079,8 +1915,14 @@
           <w:p>
             <w:pPr>
               <w:jc w:val="both"/>
-            </w:pPr>
-            <w:r>
+              <w:rPr>
+                <w:color w:val="FF0000"/>
+              </w:rPr>
+            </w:pPr>
+            <w:r>
+              <w:rPr>
+                <w:color w:val="FF0000"/>
+              </w:rPr>
               <w:t>5587558534936.6865234375</w:t>
             </w:r>
           </w:p>
@@ -2099,8 +1941,14 @@
           <w:p>
             <w:pPr>
               <w:jc w:val="both"/>
-            </w:pPr>
-            <w:r>
+              <w:rPr>
+                <w:color w:val="FF0000"/>
+              </w:rPr>
+            </w:pPr>
+            <w:r>
+              <w:rPr>
+                <w:color w:val="FF0000"/>
+              </w:rPr>
               <w:t>0</w:t>
             </w:r>
           </w:p>
@@ -2114,8 +1962,14 @@
           <w:p>
             <w:pPr>
               <w:jc w:val="both"/>
-            </w:pPr>
-            <w:r>
+              <w:rPr>
+                <w:color w:val="FF0000"/>
+              </w:rPr>
+            </w:pPr>
+            <w:r>
+              <w:rPr>
+                <w:color w:val="FF0000"/>
+              </w:rPr>
               <w:t>is.txt</w:t>
             </w:r>
           </w:p>
@@ -2129,8 +1983,14 @@
           <w:p>
             <w:pPr>
               <w:jc w:val="both"/>
-            </w:pPr>
-            <w:r>
+              <w:rPr>
+                <w:color w:val="FF0000"/>
+              </w:rPr>
+            </w:pPr>
+            <w:r>
+              <w:rPr>
+                <w:color w:val="FF0000"/>
+              </w:rPr>
               <w:t>328752462610.43621826171875</w:t>
             </w:r>
           </w:p>
@@ -2149,8 +2009,14 @@
           <w:p>
             <w:pPr>
               <w:jc w:val="both"/>
-            </w:pPr>
-            <w:r>
+              <w:rPr>
+                <w:color w:val="FF0000"/>
+              </w:rPr>
+            </w:pPr>
+            <w:r>
+              <w:rPr>
+                <w:color w:val="FF0000"/>
+              </w:rPr>
               <w:t>0</w:t>
             </w:r>
           </w:p>
@@ -2164,8 +2030,14 @@
           <w:p>
             <w:pPr>
               <w:jc w:val="both"/>
-            </w:pPr>
-            <w:r>
+              <w:rPr>
+                <w:color w:val="FF0000"/>
+              </w:rPr>
+            </w:pPr>
+            <w:r>
+              <w:rPr>
+                <w:color w:val="FF0000"/>
+              </w:rPr>
               <w:t>lecture.txt</w:t>
             </w:r>
           </w:p>
@@ -2179,8 +2051,14 @@
           <w:p>
             <w:pPr>
               <w:jc w:val="both"/>
-            </w:pPr>
-            <w:r>
+              <w:rPr>
+                <w:color w:val="FF0000"/>
+              </w:rPr>
+            </w:pPr>
+            <w:r>
+              <w:rPr>
+                <w:color w:val="FF0000"/>
+              </w:rPr>
               <w:t>2229772693447.2646484375</w:t>
             </w:r>
           </w:p>
@@ -2199,8 +2077,14 @@
           <w:p>
             <w:pPr>
               <w:jc w:val="both"/>
-            </w:pPr>
-            <w:r>
+              <w:rPr>
+                <w:color w:val="FF0000"/>
+              </w:rPr>
+            </w:pPr>
+            <w:r>
+              <w:rPr>
+                <w:color w:val="FF0000"/>
+              </w:rPr>
               <w:t>0</w:t>
             </w:r>
           </w:p>
@@ -2214,8 +2098,14 @@
           <w:p>
             <w:pPr>
               <w:jc w:val="both"/>
-            </w:pPr>
-            <w:r>
+              <w:rPr>
+                <w:color w:val="FF0000"/>
+              </w:rPr>
+            </w:pPr>
+            <w:r>
+              <w:rPr>
+                <w:color w:val="FF0000"/>
+              </w:rPr>
               <w:t>long.txt</w:t>
             </w:r>
           </w:p>
@@ -2229,8 +2119,14 @@
           <w:p>
             <w:pPr>
               <w:jc w:val="both"/>
-            </w:pPr>
-            <w:r>
+              <w:rPr>
+                <w:color w:val="FF0000"/>
+              </w:rPr>
+            </w:pPr>
+            <w:r>
+              <w:rPr>
+                <w:color w:val="FF0000"/>
+              </w:rPr>
               <w:t>5042281892454.80859375</w:t>
             </w:r>
           </w:p>
@@ -2249,8 +2145,14 @@
           <w:p>
             <w:pPr>
               <w:jc w:val="both"/>
-            </w:pPr>
-            <w:r>
+              <w:rPr>
+                <w:color w:val="FF0000"/>
+              </w:rPr>
+            </w:pPr>
+            <w:r>
+              <w:rPr>
+                <w:color w:val="FF0000"/>
+              </w:rPr>
               <w:t>0</w:t>
             </w:r>
           </w:p>
@@ -2264,8 +2166,14 @@
           <w:p>
             <w:pPr>
               <w:jc w:val="both"/>
-            </w:pPr>
-            <w:r>
+              <w:rPr>
+                <w:color w:val="FF0000"/>
+              </w:rPr>
+            </w:pPr>
+            <w:r>
+              <w:rPr>
+                <w:color w:val="FF0000"/>
+              </w:rPr>
               <w:t>make.txt</w:t>
             </w:r>
           </w:p>
@@ -2279,8 +2187,14 @@
           <w:p>
             <w:pPr>
               <w:jc w:val="both"/>
-            </w:pPr>
-            <w:r>
+              <w:rPr>
+                <w:color w:val="FF0000"/>
+              </w:rPr>
+            </w:pPr>
+            <w:r>
+              <w:rPr>
+                <w:color w:val="FF0000"/>
+              </w:rPr>
               <w:t>967643418592.1802978515625</w:t>
             </w:r>
           </w:p>
@@ -2299,8 +2213,14 @@
           <w:p>
             <w:pPr>
               <w:jc w:val="both"/>
-            </w:pPr>
-            <w:r>
+              <w:rPr>
+                <w:color w:val="FF0000"/>
+              </w:rPr>
+            </w:pPr>
+            <w:r>
+              <w:rPr>
+                <w:color w:val="FF0000"/>
+              </w:rPr>
               <w:t>0</w:t>
             </w:r>
           </w:p>
@@ -2314,8 +2234,14 @@
           <w:p>
             <w:pPr>
               <w:jc w:val="both"/>
-            </w:pPr>
-            <w:r>
+              <w:rPr>
+                <w:color w:val="FF0000"/>
+              </w:rPr>
+            </w:pPr>
+            <w:r>
+              <w:rPr>
+                <w:color w:val="FF0000"/>
+              </w:rPr>
               <w:t>method.txt</w:t>
             </w:r>
           </w:p>
@@ -2329,8 +2255,14 @@
           <w:p>
             <w:pPr>
               <w:jc w:val="both"/>
-            </w:pPr>
-            <w:r>
+              <w:rPr>
+                <w:color w:val="FF0000"/>
+              </w:rPr>
+            </w:pPr>
+            <w:r>
+              <w:rPr>
+                <w:color w:val="FF0000"/>
+              </w:rPr>
               <w:t>1657162888482.95166015625</w:t>
             </w:r>
           </w:p>
@@ -2349,8 +2281,14 @@
           <w:p>
             <w:pPr>
               <w:jc w:val="both"/>
-            </w:pPr>
-            <w:r>
+              <w:rPr>
+                <w:color w:val="FF0000"/>
+              </w:rPr>
+            </w:pPr>
+            <w:r>
+              <w:rPr>
+                <w:color w:val="FF0000"/>
+              </w:rPr>
               <w:t>0</w:t>
             </w:r>
           </w:p>
@@ -2364,8 +2302,14 @@
           <w:p>
             <w:pPr>
               <w:jc w:val="both"/>
-            </w:pPr>
-            <w:r>
+              <w:rPr>
+                <w:color w:val="FF0000"/>
+              </w:rPr>
+            </w:pPr>
+            <w:r>
+              <w:rPr>
+                <w:color w:val="FF0000"/>
+              </w:rPr>
               <w:t>mistake.txt</w:t>
             </w:r>
           </w:p>
@@ -2379,8 +2323,14 @@
           <w:p>
             <w:pPr>
               <w:jc w:val="both"/>
-            </w:pPr>
-            <w:r>
+              <w:rPr>
+                <w:color w:val="FF0000"/>
+              </w:rPr>
+            </w:pPr>
+            <w:r>
+              <w:rPr>
+                <w:color w:val="FF0000"/>
+              </w:rPr>
               <w:t>3864813446081.734375</w:t>
             </w:r>
           </w:p>
@@ -2399,8 +2349,14 @@
           <w:p>
             <w:pPr>
               <w:jc w:val="both"/>
-            </w:pPr>
-            <w:r>
+              <w:rPr>
+                <w:color w:val="FF0000"/>
+              </w:rPr>
+            </w:pPr>
+            <w:r>
+              <w:rPr>
+                <w:color w:val="FF0000"/>
+              </w:rPr>
               <w:t>0</w:t>
             </w:r>
           </w:p>
@@ -2414,8 +2370,14 @@
           <w:p>
             <w:pPr>
               <w:jc w:val="both"/>
-            </w:pPr>
-            <w:r>
+              <w:rPr>
+                <w:color w:val="FF0000"/>
+              </w:rPr>
+            </w:pPr>
+            <w:r>
+              <w:rPr>
+                <w:color w:val="FF0000"/>
+              </w:rPr>
               <w:t>no.txt</w:t>
             </w:r>
           </w:p>
@@ -2429,8 +2391,14 @@
           <w:p>
             <w:pPr>
               <w:jc w:val="both"/>
-            </w:pPr>
-            <w:r>
+              <w:rPr>
+                <w:color w:val="FF0000"/>
+              </w:rPr>
+            </w:pPr>
+            <w:r>
+              <w:rPr>
+                <w:color w:val="FF0000"/>
+              </w:rPr>
               <w:t>2456142621355.84130859375</w:t>
             </w:r>
           </w:p>
@@ -2449,8 +2417,14 @@
           <w:p>
             <w:pPr>
               <w:jc w:val="both"/>
-            </w:pPr>
-            <w:r>
+              <w:rPr>
+                <w:color w:val="FF0000"/>
+              </w:rPr>
+            </w:pPr>
+            <w:r>
+              <w:rPr>
+                <w:color w:val="FF0000"/>
+              </w:rPr>
               <w:t>0</w:t>
             </w:r>
           </w:p>
@@ -2464,8 +2438,14 @@
           <w:p>
             <w:pPr>
               <w:jc w:val="both"/>
-            </w:pPr>
-            <w:r>
+              <w:rPr>
+                <w:color w:val="FF0000"/>
+              </w:rPr>
+            </w:pPr>
+            <w:r>
+              <w:rPr>
+                <w:color w:val="FF0000"/>
+              </w:rPr>
               <w:t>prepare.txt</w:t>
             </w:r>
           </w:p>
@@ -2479,8 +2459,14 @@
           <w:p>
             <w:pPr>
               <w:jc w:val="both"/>
-            </w:pPr>
-            <w:r>
+              <w:rPr>
+                <w:color w:val="FF0000"/>
+              </w:rPr>
+            </w:pPr>
+            <w:r>
+              <w:rPr>
+                <w:color w:val="FF0000"/>
+              </w:rPr>
               <w:t>1487154767604.3125</w:t>
             </w:r>
           </w:p>
@@ -2499,8 +2485,14 @@
           <w:p>
             <w:pPr>
               <w:jc w:val="both"/>
-            </w:pPr>
-            <w:r>
+              <w:rPr>
+                <w:color w:val="FF0000"/>
+              </w:rPr>
+            </w:pPr>
+            <w:r>
+              <w:rPr>
+                <w:color w:val="FF0000"/>
+              </w:rPr>
               <w:t>0</w:t>
             </w:r>
           </w:p>
@@ -2514,8 +2506,14 @@
           <w:p>
             <w:pPr>
               <w:jc w:val="both"/>
-            </w:pPr>
-            <w:r>
+              <w:rPr>
+                <w:color w:val="FF0000"/>
+              </w:rPr>
+            </w:pPr>
+            <w:r>
+              <w:rPr>
+                <w:color w:val="FF0000"/>
+              </w:rPr>
               <w:t>probable.txt</w:t>
             </w:r>
           </w:p>
@@ -2529,8 +2527,14 @@
           <w:p>
             <w:pPr>
               <w:jc w:val="both"/>
-            </w:pPr>
-            <w:r>
+              <w:rPr>
+                <w:color w:val="FF0000"/>
+              </w:rPr>
+            </w:pPr>
+            <w:r>
+              <w:rPr>
+                <w:color w:val="FF0000"/>
+              </w:rPr>
               <w:t>668945228951.578369140625</w:t>
             </w:r>
           </w:p>
@@ -2549,8 +2553,14 @@
           <w:p>
             <w:pPr>
               <w:jc w:val="both"/>
-            </w:pPr>
-            <w:r>
+              <w:rPr>
+                <w:color w:val="FF0000"/>
+              </w:rPr>
+            </w:pPr>
+            <w:r>
+              <w:rPr>
+                <w:color w:val="FF0000"/>
+              </w:rPr>
               <w:t>0</w:t>
             </w:r>
           </w:p>
@@ -2564,8 +2574,14 @@
           <w:p>
             <w:pPr>
               <w:jc w:val="both"/>
-            </w:pPr>
-            <w:r>
+              <w:rPr>
+                <w:color w:val="FF0000"/>
+              </w:rPr>
+            </w:pPr>
+            <w:r>
+              <w:rPr>
+                <w:color w:val="FF0000"/>
+              </w:rPr>
               <w:t>solution.txt</w:t>
             </w:r>
           </w:p>
@@ -2579,8 +2595,14 @@
           <w:p>
             <w:pPr>
               <w:jc w:val="both"/>
-            </w:pPr>
-            <w:r>
+              <w:rPr>
+                <w:color w:val="FF0000"/>
+              </w:rPr>
+            </w:pPr>
+            <w:r>
+              <w:rPr>
+                <w:color w:val="FF0000"/>
+              </w:rPr>
               <w:t>2160031109297.03125</w:t>
             </w:r>
           </w:p>
@@ -2599,8 +2621,14 @@
           <w:p>
             <w:pPr>
               <w:jc w:val="both"/>
-            </w:pPr>
-            <w:r>
+              <w:rPr>
+                <w:color w:val="FF0000"/>
+              </w:rPr>
+            </w:pPr>
+            <w:r>
+              <w:rPr>
+                <w:color w:val="FF0000"/>
+              </w:rPr>
               <w:t>0</w:t>
             </w:r>
           </w:p>
@@ -2614,8 +2642,14 @@
           <w:p>
             <w:pPr>
               <w:jc w:val="both"/>
-            </w:pPr>
-            <w:r>
+              <w:rPr>
+                <w:color w:val="FF0000"/>
+              </w:rPr>
+            </w:pPr>
+            <w:r>
+              <w:rPr>
+                <w:color w:val="FF0000"/>
+              </w:rPr>
               <w:t>succeed.txt</w:t>
             </w:r>
           </w:p>
@@ -2629,8 +2663,14 @@
           <w:p>
             <w:pPr>
               <w:jc w:val="both"/>
-            </w:pPr>
-            <w:r>
+              <w:rPr>
+                <w:color w:val="FF0000"/>
+              </w:rPr>
+            </w:pPr>
+            <w:r>
+              <w:rPr>
+                <w:color w:val="FF0000"/>
+              </w:rPr>
               <w:t>2148125857232.156005859375</w:t>
             </w:r>
           </w:p>
@@ -2649,8 +2689,14 @@
           <w:p>
             <w:pPr>
               <w:jc w:val="both"/>
-            </w:pPr>
-            <w:r>
+              <w:rPr>
+                <w:color w:val="FF0000"/>
+              </w:rPr>
+            </w:pPr>
+            <w:r>
+              <w:rPr>
+                <w:color w:val="FF0000"/>
+              </w:rPr>
               <w:t>0</w:t>
             </w:r>
           </w:p>
@@ -2664,8 +2710,14 @@
           <w:p>
             <w:pPr>
               <w:jc w:val="both"/>
-            </w:pPr>
-            <w:r>
+              <w:rPr>
+                <w:color w:val="FF0000"/>
+              </w:rPr>
+            </w:pPr>
+            <w:r>
+              <w:rPr>
+                <w:color w:val="FF0000"/>
+              </w:rPr>
               <w:t>the.txt</w:t>
             </w:r>
           </w:p>
@@ -2679,8 +2731,14 @@
           <w:p>
             <w:pPr>
               <w:jc w:val="both"/>
-            </w:pPr>
-            <w:r>
+              <w:rPr>
+                <w:color w:val="FF0000"/>
+              </w:rPr>
+            </w:pPr>
+            <w:r>
+              <w:rPr>
+                <w:color w:val="FF0000"/>
+              </w:rPr>
               <w:t>3865974691683.6123046875</w:t>
             </w:r>
           </w:p>
@@ -2699,8 +2757,14 @@
           <w:p>
             <w:pPr>
               <w:jc w:val="both"/>
-            </w:pPr>
-            <w:r>
+              <w:rPr>
+                <w:color w:val="FF0000"/>
+              </w:rPr>
+            </w:pPr>
+            <w:r>
+              <w:rPr>
+                <w:color w:val="FF0000"/>
+              </w:rPr>
               <w:t>0</w:t>
             </w:r>
           </w:p>
@@ -2714,8 +2778,14 @@
           <w:p>
             <w:pPr>
               <w:jc w:val="both"/>
-            </w:pPr>
-            <w:r>
+              <w:rPr>
+                <w:color w:val="FF0000"/>
+              </w:rPr>
+            </w:pPr>
+            <w:r>
+              <w:rPr>
+                <w:color w:val="FF0000"/>
+              </w:rPr>
               <w:t>time.txt</w:t>
             </w:r>
           </w:p>
@@ -2729,8 +2799,14 @@
           <w:p>
             <w:pPr>
               <w:jc w:val="both"/>
-            </w:pPr>
-            <w:r>
+              <w:rPr>
+                <w:color w:val="FF0000"/>
+              </w:rPr>
+            </w:pPr>
+            <w:r>
+              <w:rPr>
+                <w:color w:val="FF0000"/>
+              </w:rPr>
               <w:t>5668595140863.4931640625</w:t>
             </w:r>
           </w:p>
@@ -2749,8 +2825,14 @@
           <w:p>
             <w:pPr>
               <w:jc w:val="both"/>
-            </w:pPr>
-            <w:r>
+              <w:rPr>
+                <w:color w:val="FF0000"/>
+              </w:rPr>
+            </w:pPr>
+            <w:r>
+              <w:rPr>
+                <w:color w:val="FF0000"/>
+              </w:rPr>
               <w:t>0</w:t>
             </w:r>
           </w:p>
@@ -2764,8 +2846,14 @@
           <w:p>
             <w:pPr>
               <w:jc w:val="both"/>
-            </w:pPr>
-            <w:r>
+              <w:rPr>
+                <w:color w:val="FF0000"/>
+              </w:rPr>
+            </w:pPr>
+            <w:r>
+              <w:rPr>
+                <w:color w:val="FF0000"/>
+              </w:rPr>
               <w:t>work.txt</w:t>
             </w:r>
           </w:p>
@@ -2779,8 +2867,14 @@
           <w:p>
             <w:pPr>
               <w:jc w:val="both"/>
-            </w:pPr>
-            <w:r>
+              <w:rPr>
+                <w:color w:val="FF0000"/>
+              </w:rPr>
+            </w:pPr>
+            <w:r>
+              <w:rPr>
+                <w:color w:val="FF0000"/>
+              </w:rPr>
               <w:t>2259847896082.892578125</w:t>
             </w:r>
           </w:p>
@@ -2799,8 +2893,14 @@
           <w:p>
             <w:pPr>
               <w:jc w:val="both"/>
-            </w:pPr>
-            <w:r>
+              <w:rPr>
+                <w:color w:val="FF0000"/>
+              </w:rPr>
+            </w:pPr>
+            <w:r>
+              <w:rPr>
+                <w:color w:val="FF0000"/>
+              </w:rPr>
               <w:t>1</w:t>
             </w:r>
           </w:p>
@@ -2814,8 +2914,14 @@
           <w:p>
             <w:pPr>
               <w:jc w:val="both"/>
-            </w:pPr>
-            <w:r>
+              <w:rPr>
+                <w:color w:val="FF0000"/>
+              </w:rPr>
+            </w:pPr>
+            <w:r>
+              <w:rPr>
+                <w:color w:val="FF0000"/>
+              </w:rPr>
               <w:t>advice.txt</w:t>
             </w:r>
           </w:p>
@@ -2829,8 +2935,14 @@
           <w:p>
             <w:pPr>
               <w:jc w:val="both"/>
-            </w:pPr>
-            <w:r>
+              <w:rPr>
+                <w:color w:val="FF0000"/>
+              </w:rPr>
+            </w:pPr>
+            <w:r>
+              <w:rPr>
+                <w:color w:val="FF0000"/>
+              </w:rPr>
               <w:t>613641431591.2109375</w:t>
             </w:r>
           </w:p>
@@ -2849,8 +2961,14 @@
           <w:p>
             <w:pPr>
               <w:jc w:val="both"/>
-            </w:pPr>
-            <w:r>
+              <w:rPr>
+                <w:color w:val="FF0000"/>
+              </w:rPr>
+            </w:pPr>
+            <w:r>
+              <w:rPr>
+                <w:color w:val="FF0000"/>
+              </w:rPr>
               <w:t>1</w:t>
             </w:r>
           </w:p>
@@ -2864,8 +2982,14 @@
           <w:p>
             <w:pPr>
               <w:jc w:val="both"/>
-            </w:pPr>
-            <w:r>
+              <w:rPr>
+                <w:color w:val="FF0000"/>
+              </w:rPr>
+            </w:pPr>
+            <w:r>
+              <w:rPr>
+                <w:color w:val="FF0000"/>
+              </w:rPr>
               <w:t>disaster.txt</w:t>
             </w:r>
           </w:p>
@@ -2879,8 +3003,14 @@
           <w:p>
             <w:pPr>
               <w:jc w:val="both"/>
-            </w:pPr>
-            <w:r>
+              <w:rPr>
+                <w:color w:val="FF0000"/>
+              </w:rPr>
+            </w:pPr>
+            <w:r>
+              <w:rPr>
+                <w:color w:val="FF0000"/>
+              </w:rPr>
               <w:t>2551743696215.69677734375</w:t>
             </w:r>
           </w:p>
@@ -2899,8 +3029,14 @@
           <w:p>
             <w:pPr>
               <w:jc w:val="both"/>
-            </w:pPr>
-            <w:r>
+              <w:rPr>
+                <w:color w:val="FF0000"/>
+              </w:rPr>
+            </w:pPr>
+            <w:r>
+              <w:rPr>
+                <w:color w:val="FF0000"/>
+              </w:rPr>
               <w:t>1</w:t>
             </w:r>
           </w:p>
@@ -2914,8 +3050,14 @@
           <w:p>
             <w:pPr>
               <w:jc w:val="both"/>
-            </w:pPr>
-            <w:r>
+              <w:rPr>
+                <w:color w:val="FF0000"/>
+              </w:rPr>
+            </w:pPr>
+            <w:r>
+              <w:rPr>
+                <w:color w:val="FF0000"/>
+              </w:rPr>
               <w:t>easy.txt</w:t>
             </w:r>
           </w:p>
@@ -2929,8 +3071,14 @@
           <w:p>
             <w:pPr>
               <w:jc w:val="both"/>
-            </w:pPr>
-            <w:r>
+              <w:rPr>
+                <w:color w:val="FF0000"/>
+              </w:rPr>
+            </w:pPr>
+            <w:r>
+              <w:rPr>
+                <w:color w:val="FF0000"/>
+              </w:rPr>
               <w:t>5753556997173.95703125</w:t>
             </w:r>
           </w:p>
@@ -2949,8 +3097,14 @@
           <w:p>
             <w:pPr>
               <w:jc w:val="both"/>
-            </w:pPr>
-            <w:r>
+              <w:rPr>
+                <w:color w:val="FF0000"/>
+              </w:rPr>
+            </w:pPr>
+            <w:r>
+              <w:rPr>
+                <w:color w:val="FF0000"/>
+              </w:rPr>
               <w:t>1</w:t>
             </w:r>
           </w:p>
@@ -2964,8 +3118,14 @@
           <w:p>
             <w:pPr>
               <w:jc w:val="both"/>
-            </w:pPr>
-            <w:r>
+              <w:rPr>
+                <w:color w:val="FF0000"/>
+              </w:rPr>
+            </w:pPr>
+            <w:r>
+              <w:rPr>
+                <w:color w:val="FF0000"/>
+              </w:rPr>
               <w:t>fail.txt</w:t>
             </w:r>
           </w:p>
@@ -2979,8 +3139,14 @@
           <w:p>
             <w:pPr>
               <w:jc w:val="both"/>
-            </w:pPr>
-            <w:r>
+              <w:rPr>
+                <w:color w:val="FF0000"/>
+              </w:rPr>
+            </w:pPr>
+            <w:r>
+              <w:rPr>
+                <w:color w:val="FF0000"/>
+              </w:rPr>
               <w:t>5483180298929.7138671875</w:t>
             </w:r>
           </w:p>
@@ -2999,8 +3165,14 @@
           <w:p>
             <w:pPr>
               <w:jc w:val="both"/>
-            </w:pPr>
-            <w:r>
+              <w:rPr>
+                <w:color w:val="FF0000"/>
+              </w:rPr>
+            </w:pPr>
+            <w:r>
+              <w:rPr>
+                <w:color w:val="FF0000"/>
+              </w:rPr>
               <w:t>1</w:t>
             </w:r>
           </w:p>
@@ -3014,8 +3186,14 @@
           <w:p>
             <w:pPr>
               <w:jc w:val="both"/>
-            </w:pPr>
-            <w:r>
+              <w:rPr>
+                <w:color w:val="FF0000"/>
+              </w:rPr>
+            </w:pPr>
+            <w:r>
+              <w:rPr>
+                <w:color w:val="FF0000"/>
+              </w:rPr>
               <w:t>for.txt</w:t>
             </w:r>
           </w:p>
@@ -3029,8 +3207,14 @@
           <w:p>
             <w:pPr>
               <w:jc w:val="both"/>
-            </w:pPr>
-            <w:r>
+              <w:rPr>
+                <w:color w:val="FF0000"/>
+              </w:rPr>
+            </w:pPr>
+            <w:r>
+              <w:rPr>
+                <w:color w:val="FF0000"/>
+              </w:rPr>
               <w:t>531449542025.907470703125</w:t>
             </w:r>
           </w:p>
@@ -3049,8 +3233,14 @@
           <w:p>
             <w:pPr>
               <w:jc w:val="both"/>
-            </w:pPr>
-            <w:r>
+              <w:rPr>
+                <w:color w:val="FF0000"/>
+              </w:rPr>
+            </w:pPr>
+            <w:r>
+              <w:rPr>
+                <w:color w:val="FF0000"/>
+              </w:rPr>
               <w:t>1</w:t>
             </w:r>
           </w:p>
@@ -3064,8 +3254,14 @@
           <w:p>
             <w:pPr>
               <w:jc w:val="both"/>
-            </w:pPr>
-            <w:r>
+              <w:rPr>
+                <w:color w:val="FF0000"/>
+              </w:rPr>
+            </w:pPr>
+            <w:r>
+              <w:rPr>
+                <w:color w:val="FF0000"/>
+              </w:rPr>
               <w:t>give.txt</w:t>
             </w:r>
           </w:p>
@@ -3079,8 +3275,14 @@
           <w:p>
             <w:pPr>
               <w:jc w:val="both"/>
-            </w:pPr>
-            <w:r>
+              <w:rPr>
+                <w:color w:val="FF0000"/>
+              </w:rPr>
+            </w:pPr>
+            <w:r>
+              <w:rPr>
+                <w:color w:val="FF0000"/>
+              </w:rPr>
               <w:t>131229957831.0837554931640625</w:t>
             </w:r>
           </w:p>
@@ -3099,8 +3301,14 @@
           <w:p>
             <w:pPr>
               <w:jc w:val="both"/>
-            </w:pPr>
-            <w:r>
+              <w:rPr>
+                <w:color w:val="FF0000"/>
+              </w:rPr>
+            </w:pPr>
+            <w:r>
+              <w:rPr>
+                <w:color w:val="FF0000"/>
+              </w:rPr>
               <w:t>1</w:t>
             </w:r>
           </w:p>
@@ -3114,8 +3322,14 @@
           <w:p>
             <w:pPr>
               <w:jc w:val="both"/>
-            </w:pPr>
-            <w:r>
+              <w:rPr>
+                <w:color w:val="FF0000"/>
+              </w:rPr>
+            </w:pPr>
+            <w:r>
+              <w:rPr>
+                <w:color w:val="FF0000"/>
+              </w:rPr>
               <w:t>idea.txt</w:t>
             </w:r>
           </w:p>
@@ -3129,8 +3343,14 @@
           <w:p>
             <w:pPr>
               <w:jc w:val="both"/>
-            </w:pPr>
-            <w:r>
+              <w:rPr>
+                <w:color w:val="FF0000"/>
+              </w:rPr>
+            </w:pPr>
+            <w:r>
+              <w:rPr>
+                <w:color w:val="FF0000"/>
+              </w:rPr>
               <w:t>844241613018.8228759765625</w:t>
             </w:r>
           </w:p>
@@ -3149,8 +3369,14 @@
           <w:p>
             <w:pPr>
               <w:jc w:val="both"/>
-            </w:pPr>
-            <w:r>
+              <w:rPr>
+                <w:color w:val="FF0000"/>
+              </w:rPr>
+            </w:pPr>
+            <w:r>
+              <w:rPr>
+                <w:color w:val="FF0000"/>
+              </w:rPr>
               <w:t>1</w:t>
             </w:r>
           </w:p>
@@ -3164,8 +3390,14 @@
           <w:p>
             <w:pPr>
               <w:jc w:val="both"/>
-            </w:pPr>
-            <w:r>
+              <w:rPr>
+                <w:color w:val="FF0000"/>
+              </w:rPr>
+            </w:pPr>
+            <w:r>
+              <w:rPr>
+                <w:color w:val="FF0000"/>
+              </w:rPr>
               <w:t>is.txt</w:t>
             </w:r>
           </w:p>
@@ -3179,8 +3411,14 @@
           <w:p>
             <w:pPr>
               <w:jc w:val="both"/>
-            </w:pPr>
-            <w:r>
+              <w:rPr>
+                <w:color w:val="FF0000"/>
+              </w:rPr>
+            </w:pPr>
+            <w:r>
+              <w:rPr>
+                <w:color w:val="FF0000"/>
+              </w:rPr>
               <w:t>78342805738.9263916015625</w:t>
             </w:r>
           </w:p>
@@ -3199,8 +3437,14 @@
           <w:p>
             <w:pPr>
               <w:jc w:val="both"/>
-            </w:pPr>
-            <w:r>
+              <w:rPr>
+                <w:color w:val="FF0000"/>
+              </w:rPr>
+            </w:pPr>
+            <w:r>
+              <w:rPr>
+                <w:color w:val="FF0000"/>
+              </w:rPr>
               <w:t>1</w:t>
             </w:r>
           </w:p>
@@ -3214,8 +3458,14 @@
           <w:p>
             <w:pPr>
               <w:jc w:val="both"/>
-            </w:pPr>
-            <w:r>
+              <w:rPr>
+                <w:color w:val="FF0000"/>
+              </w:rPr>
+            </w:pPr>
+            <w:r>
+              <w:rPr>
+                <w:color w:val="FF0000"/>
+              </w:rPr>
               <w:t>lecture.txt</w:t>
             </w:r>
           </w:p>
@@ -3229,8 +3479,14 @@
           <w:p>
             <w:pPr>
               <w:jc w:val="both"/>
-            </w:pPr>
-            <w:r>
+              <w:rPr>
+                <w:color w:val="FF0000"/>
+              </w:rPr>
+            </w:pPr>
+            <w:r>
+              <w:rPr>
+                <w:color w:val="FF0000"/>
+              </w:rPr>
               <w:t>455531362817.89215087890625</w:t>
             </w:r>
           </w:p>
@@ -3249,8 +3505,14 @@
           <w:p>
             <w:pPr>
               <w:jc w:val="both"/>
-            </w:pPr>
-            <w:r>
+              <w:rPr>
+                <w:color w:val="FF0000"/>
+              </w:rPr>
+            </w:pPr>
+            <w:r>
+              <w:rPr>
+                <w:color w:val="FF0000"/>
+              </w:rPr>
               <w:t>1</w:t>
             </w:r>
           </w:p>
@@ -3264,8 +3526,14 @@
           <w:p>
             <w:pPr>
               <w:jc w:val="both"/>
-            </w:pPr>
-            <w:r>
+              <w:rPr>
+                <w:color w:val="FF0000"/>
+              </w:rPr>
+            </w:pPr>
+            <w:r>
+              <w:rPr>
+                <w:color w:val="FF0000"/>
+              </w:rPr>
               <w:t>long.txt</w:t>
             </w:r>
           </w:p>
@@ -3279,8 +3547,14 @@
           <w:p>
             <w:pPr>
               <w:jc w:val="both"/>
-            </w:pPr>
-            <w:r>
+              <w:rPr>
+                <w:color w:val="FF0000"/>
+              </w:rPr>
+            </w:pPr>
+            <w:r>
+              <w:rPr>
+                <w:color w:val="FF0000"/>
+              </w:rPr>
               <w:t>1019207938200.5679931640625</w:t>
             </w:r>
           </w:p>
@@ -3299,8 +3573,14 @@
           <w:p>
             <w:pPr>
               <w:jc w:val="both"/>
-            </w:pPr>
-            <w:r>
+              <w:rPr>
+                <w:color w:val="FF0000"/>
+              </w:rPr>
+            </w:pPr>
+            <w:r>
+              <w:rPr>
+                <w:color w:val="FF0000"/>
+              </w:rPr>
               <w:t>1</w:t>
             </w:r>
           </w:p>
@@ -3314,8 +3594,14 @@
           <w:p>
             <w:pPr>
               <w:jc w:val="both"/>
-            </w:pPr>
-            <w:r>
+              <w:rPr>
+                <w:color w:val="FF0000"/>
+              </w:rPr>
+            </w:pPr>
+            <w:r>
+              <w:rPr>
+                <w:color w:val="FF0000"/>
+              </w:rPr>
               <w:t>make.txt</w:t>
             </w:r>
           </w:p>
@@ -3329,8 +3615,14 @@
           <w:p>
             <w:pPr>
               <w:jc w:val="both"/>
-            </w:pPr>
-            <w:r>
+              <w:rPr>
+                <w:color w:val="FF0000"/>
+              </w:rPr>
+            </w:pPr>
+            <w:r>
+              <w:rPr>
+                <w:color w:val="FF0000"/>
+              </w:rPr>
               <w:t>103317665434.12860107421875</w:t>
             </w:r>
           </w:p>
@@ -3349,8 +3641,14 @@
           <w:p>
             <w:pPr>
               <w:jc w:val="both"/>
-            </w:pPr>
-            <w:r>
+              <w:rPr>
+                <w:color w:val="FF0000"/>
+              </w:rPr>
+            </w:pPr>
+            <w:r>
+              <w:rPr>
+                <w:color w:val="FF0000"/>
+              </w:rPr>
               <w:t>1</w:t>
             </w:r>
           </w:p>
@@ -3364,8 +3662,14 @@
           <w:p>
             <w:pPr>
               <w:jc w:val="both"/>
-            </w:pPr>
-            <w:r>
+              <w:rPr>
+                <w:color w:val="FF0000"/>
+              </w:rPr>
+            </w:pPr>
+            <w:r>
+              <w:rPr>
+                <w:color w:val="FF0000"/>
+              </w:rPr>
               <w:t>method.txt</w:t>
             </w:r>
           </w:p>
@@ -3379,8 +3683,14 @@
           <w:p>
             <w:pPr>
               <w:jc w:val="both"/>
-            </w:pPr>
-            <w:r>
+              <w:rPr>
+                <w:color w:val="FF0000"/>
+              </w:rPr>
+            </w:pPr>
+            <w:r>
+              <w:rPr>
+                <w:color w:val="FF0000"/>
+              </w:rPr>
               <w:t>749159254673.1546630859375</w:t>
             </w:r>
           </w:p>
@@ -3399,8 +3709,14 @@
           <w:p>
             <w:pPr>
               <w:jc w:val="both"/>
-            </w:pPr>
-            <w:r>
+              <w:rPr>
+                <w:color w:val="FF0000"/>
+              </w:rPr>
+            </w:pPr>
+            <w:r>
+              <w:rPr>
+                <w:color w:val="FF0000"/>
+              </w:rPr>
               <w:t>1</w:t>
             </w:r>
           </w:p>
@@ -3414,8 +3730,14 @@
           <w:p>
             <w:pPr>
               <w:jc w:val="both"/>
-            </w:pPr>
-            <w:r>
+              <w:rPr>
+                <w:color w:val="FF0000"/>
+              </w:rPr>
+            </w:pPr>
+            <w:r>
+              <w:rPr>
+                <w:color w:val="FF0000"/>
+              </w:rPr>
               <w:t>mistake.txt</w:t>
             </w:r>
           </w:p>
@@ -3429,8 +3751,14 @@
           <w:p>
             <w:pPr>
               <w:jc w:val="both"/>
-            </w:pPr>
-            <w:r>
+              <w:rPr>
+                <w:color w:val="FF0000"/>
+              </w:rPr>
+            </w:pPr>
+            <w:r>
+              <w:rPr>
+                <w:color w:val="FF0000"/>
+              </w:rPr>
               <w:t>487427999979.248291015625</w:t>
             </w:r>
           </w:p>
@@ -3449,8 +3777,14 @@
           <w:p>
             <w:pPr>
               <w:jc w:val="both"/>
-            </w:pPr>
-            <w:r>
+              <w:rPr>
+                <w:color w:val="FF0000"/>
+              </w:rPr>
+            </w:pPr>
+            <w:r>
+              <w:rPr>
+                <w:color w:val="FF0000"/>
+              </w:rPr>
               <w:t>1</w:t>
             </w:r>
           </w:p>
@@ -3464,8 +3798,14 @@
           <w:p>
             <w:pPr>
               <w:jc w:val="both"/>
-            </w:pPr>
-            <w:r>
+              <w:rPr>
+                <w:color w:val="FF0000"/>
+              </w:rPr>
+            </w:pPr>
+            <w:r>
+              <w:rPr>
+                <w:color w:val="FF0000"/>
+              </w:rPr>
               <w:t>no.txt</w:t>
             </w:r>
           </w:p>
@@ -3479,8 +3819,14 @@
           <w:p>
             <w:pPr>
               <w:jc w:val="both"/>
-            </w:pPr>
-            <w:r>
+              <w:rPr>
+                <w:color w:val="FF0000"/>
+              </w:rPr>
+            </w:pPr>
+            <w:r>
+              <w:rPr>
+                <w:color w:val="FF0000"/>
+              </w:rPr>
               <w:t>128189821467.7370758056640625</w:t>
             </w:r>
           </w:p>
@@ -3499,8 +3845,14 @@
           <w:p>
             <w:pPr>
               <w:jc w:val="both"/>
-            </w:pPr>
-            <w:r>
+              <w:rPr>
+                <w:color w:val="FF0000"/>
+              </w:rPr>
+            </w:pPr>
+            <w:r>
+              <w:rPr>
+                <w:color w:val="FF0000"/>
+              </w:rPr>
               <w:t>1</w:t>
             </w:r>
           </w:p>
@@ -3514,8 +3866,14 @@
           <w:p>
             <w:pPr>
               <w:jc w:val="both"/>
-            </w:pPr>
-            <w:r>
+              <w:rPr>
+                <w:color w:val="FF0000"/>
+              </w:rPr>
+            </w:pPr>
+            <w:r>
+              <w:rPr>
+                <w:color w:val="FF0000"/>
+              </w:rPr>
               <w:t>prepare.txt</w:t>
             </w:r>
           </w:p>
@@ -3529,8 +3887,14 @@
           <w:p>
             <w:pPr>
               <w:jc w:val="both"/>
-            </w:pPr>
-            <w:r>
+              <w:rPr>
+                <w:color w:val="FF0000"/>
+              </w:rPr>
+            </w:pPr>
+            <w:r>
+              <w:rPr>
+                <w:color w:val="FF0000"/>
+              </w:rPr>
               <w:t>2837932155133.89697265625</w:t>
             </w:r>
           </w:p>
@@ -3549,8 +3913,14 @@
           <w:p>
             <w:pPr>
               <w:jc w:val="both"/>
-            </w:pPr>
-            <w:r>
+              <w:rPr>
+                <w:color w:val="FF0000"/>
+              </w:rPr>
+            </w:pPr>
+            <w:r>
+              <w:rPr>
+                <w:color w:val="FF0000"/>
+              </w:rPr>
               <w:t>1</w:t>
             </w:r>
           </w:p>
@@ -3564,8 +3934,14 @@
           <w:p>
             <w:pPr>
               <w:jc w:val="both"/>
-            </w:pPr>
-            <w:r>
+              <w:rPr>
+                <w:color w:val="FF0000"/>
+              </w:rPr>
+            </w:pPr>
+            <w:r>
+              <w:rPr>
+                <w:color w:val="FF0000"/>
+              </w:rPr>
               <w:t>probable.txt</w:t>
             </w:r>
           </w:p>
@@ -3579,8 +3955,14 @@
           <w:p>
             <w:pPr>
               <w:jc w:val="both"/>
-            </w:pPr>
-            <w:r>
+              <w:rPr>
+                <w:color w:val="FF0000"/>
+              </w:rPr>
+            </w:pPr>
+            <w:r>
+              <w:rPr>
+                <w:color w:val="FF0000"/>
+              </w:rPr>
               <w:t>7091089583673.3134765625</w:t>
             </w:r>
           </w:p>
@@ -3599,8 +3981,14 @@
           <w:p>
             <w:pPr>
               <w:jc w:val="both"/>
-            </w:pPr>
-            <w:r>
+              <w:rPr>
+                <w:color w:val="FF0000"/>
+              </w:rPr>
+            </w:pPr>
+            <w:r>
+              <w:rPr>
+                <w:color w:val="FF0000"/>
+              </w:rPr>
               <w:t>1</w:t>
             </w:r>
           </w:p>
@@ -3614,8 +4002,14 @@
           <w:p>
             <w:pPr>
               <w:jc w:val="both"/>
-            </w:pPr>
-            <w:r>
+              <w:rPr>
+                <w:color w:val="FF0000"/>
+              </w:rPr>
+            </w:pPr>
+            <w:r>
+              <w:rPr>
+                <w:color w:val="FF0000"/>
+              </w:rPr>
               <w:t>solution.txt</w:t>
             </w:r>
           </w:p>
@@ -3629,8 +4023,14 @@
           <w:p>
             <w:pPr>
               <w:jc w:val="both"/>
-            </w:pPr>
-            <w:r>
+              <w:rPr>
+                <w:color w:val="FF0000"/>
+              </w:rPr>
+            </w:pPr>
+            <w:r>
+              <w:rPr>
+                <w:color w:val="FF0000"/>
+              </w:rPr>
               <w:t>19798276288376.20703125</w:t>
             </w:r>
           </w:p>
@@ -3649,8 +4049,14 @@
           <w:p>
             <w:pPr>
               <w:jc w:val="both"/>
-            </w:pPr>
-            <w:r>
+              <w:rPr>
+                <w:color w:val="FF0000"/>
+              </w:rPr>
+            </w:pPr>
+            <w:r>
+              <w:rPr>
+                <w:color w:val="FF0000"/>
+              </w:rPr>
               <w:t>1</w:t>
             </w:r>
           </w:p>
@@ -3664,8 +4070,14 @@
           <w:p>
             <w:pPr>
               <w:jc w:val="both"/>
-            </w:pPr>
-            <w:r>
+              <w:rPr>
+                <w:color w:val="FF0000"/>
+              </w:rPr>
+            </w:pPr>
+            <w:r>
+              <w:rPr>
+                <w:color w:val="FF0000"/>
+              </w:rPr>
               <w:t>succeed.txt</w:t>
             </w:r>
           </w:p>
@@ -3679,8 +4091,14 @@
           <w:p>
             <w:pPr>
               <w:jc w:val="both"/>
-            </w:pPr>
-            <w:r>
+              <w:rPr>
+                <w:color w:val="FF0000"/>
+              </w:rPr>
+            </w:pPr>
+            <w:r>
+              <w:rPr>
+                <w:color w:val="FF0000"/>
+              </w:rPr>
               <w:t>6171597562007.228515625</w:t>
             </w:r>
           </w:p>
@@ -3699,8 +4117,14 @@
           <w:p>
             <w:pPr>
               <w:jc w:val="both"/>
-            </w:pPr>
-            <w:r>
+              <w:rPr>
+                <w:color w:val="FF0000"/>
+              </w:rPr>
+            </w:pPr>
+            <w:r>
+              <w:rPr>
+                <w:color w:val="FF0000"/>
+              </w:rPr>
               <w:t>1</w:t>
             </w:r>
           </w:p>
@@ -3714,8 +4138,14 @@
           <w:p>
             <w:pPr>
               <w:jc w:val="both"/>
-            </w:pPr>
-            <w:r>
+              <w:rPr>
+                <w:color w:val="FF0000"/>
+              </w:rPr>
+            </w:pPr>
+            <w:r>
+              <w:rPr>
+                <w:color w:val="FF0000"/>
+              </w:rPr>
               <w:t>the.txt</w:t>
             </w:r>
           </w:p>
@@ -3729,8 +4159,14 @@
           <w:p>
             <w:pPr>
               <w:jc w:val="both"/>
-            </w:pPr>
-            <w:r>
+              <w:rPr>
+                <w:color w:val="FF0000"/>
+              </w:rPr>
+            </w:pPr>
+            <w:r>
+              <w:rPr>
+                <w:color w:val="FF0000"/>
+              </w:rPr>
               <w:t>1168004353072.59619140625</w:t>
             </w:r>
           </w:p>
@@ -3749,8 +4185,14 @@
           <w:p>
             <w:pPr>
               <w:jc w:val="both"/>
-            </w:pPr>
-            <w:r>
+              <w:rPr>
+                <w:color w:val="FF0000"/>
+              </w:rPr>
+            </w:pPr>
+            <w:r>
+              <w:rPr>
+                <w:color w:val="FF0000"/>
+              </w:rPr>
               <w:t>1</w:t>
             </w:r>
           </w:p>
@@ -3764,8 +4206,14 @@
           <w:p>
             <w:pPr>
               <w:jc w:val="both"/>
-            </w:pPr>
-            <w:r>
+              <w:rPr>
+                <w:color w:val="FF0000"/>
+              </w:rPr>
+            </w:pPr>
+            <w:r>
+              <w:rPr>
+                <w:color w:val="FF0000"/>
+              </w:rPr>
               <w:t>time.txt</w:t>
             </w:r>
           </w:p>
@@ -3779,8 +4227,14 @@
           <w:p>
             <w:pPr>
               <w:jc w:val="both"/>
-            </w:pPr>
-            <w:r>
+              <w:rPr>
+                <w:color w:val="FF0000"/>
+              </w:rPr>
+            </w:pPr>
+            <w:r>
+              <w:rPr>
+                <w:color w:val="FF0000"/>
+              </w:rPr>
               <w:t>419902157282.68475341796875</w:t>
             </w:r>
           </w:p>
@@ -3848,37 +4302,20 @@
       </w:pPr>
       <w:r>
         <w:lastRenderedPageBreak/>
-        <w:t>Porovnání</w:t>
-      </w:r>
-      <w:r>
-        <w:t xml:space="preserve"> – Singal</w:t>
-      </w:r>
-      <w:r>
-        <w:t>2</w:t>
-      </w:r>
-      <w:r>
-        <w:t>.txt</w:t>
+        <w:t>Porovnání – Singal2.txt</w:t>
       </w:r>
     </w:p>
     <w:p/>
     <w:p>
       <w:pPr>
         <w:jc w:val="both"/>
-        <w:rPr>
-          <w:color w:val="FF0000"/>
-        </w:rPr>
       </w:pPr>
       <w:r>
-        <w:t xml:space="preserve">U druhého referenčního signálu bylo potřeba nastavit </w:t>
+        <w:t xml:space="preserve">U druhého referenčního signálu bylo potřeba </w:t>
       </w:r>
-      <w:proofErr w:type="spellStart"/>
       <w:r>
-        <w:rPr>
-          <w:color w:val="FF0000"/>
-        </w:rPr>
-        <w:t>treshold</w:t>
+        <w:t>zvýšit prahovou hodnotu pro detekci jednotlivých slov, následně vše probíhalo jako u prvního signálu.</w:t>
       </w:r>
-      <w:proofErr w:type="spellEnd"/>
     </w:p>
     <w:p>
       <w:pPr>
@@ -3889,9 +4326,9 @@
           <w:noProof/>
         </w:rPr>
         <w:drawing>
-          <wp:inline distT="0" distB="0" distL="0" distR="0" wp14:anchorId="56F8D7EE" wp14:editId="7744407A">
-            <wp:extent cx="5762625" cy="2876550"/>
-            <wp:effectExtent l="0" t="0" r="9525" b="0"/>
+          <wp:inline distT="0" distB="0" distL="0" distR="0" wp14:anchorId="56F8D7EE" wp14:editId="5FF816A4">
+            <wp:extent cx="5753100" cy="2876550"/>
+            <wp:effectExtent l="0" t="0" r="0" b="0"/>
             <wp:docPr id="1990743075" name="Obrázek 9"/>
             <wp:cNvGraphicFramePr>
               <a:graphicFrameLocks xmlns:a="http://schemas.openxmlformats.org/drawingml/2006/main" noChangeAspect="1"/>
@@ -3900,7 +4337,7 @@
               <a:graphicData uri="http://schemas.openxmlformats.org/drawingml/2006/picture">
                 <pic:pic xmlns:pic="http://schemas.openxmlformats.org/drawingml/2006/picture">
                   <pic:nvPicPr>
-                    <pic:cNvPr id="0" name="Picture 14"/>
+                    <pic:cNvPr id="1990743075" name="Obrázek 9"/>
                     <pic:cNvPicPr>
                       <a:picLocks noChangeAspect="1" noChangeArrowheads="1"/>
                     </pic:cNvPicPr>
@@ -3913,7 +4350,6 @@
                         </a:ext>
                       </a:extLst>
                     </a:blip>
-                    <a:srcRect/>
                     <a:stretch>
                       <a:fillRect/>
                     </a:stretch>
@@ -3921,7 +4357,7 @@
                   <pic:spPr bwMode="auto">
                     <a:xfrm>
                       <a:off x="0" y="0"/>
-                      <a:ext cx="5762625" cy="2876550"/>
+                      <a:ext cx="5753100" cy="2876550"/>
                     </a:xfrm>
                     <a:prstGeom prst="rect">
                       <a:avLst/>
@@ -3947,9 +4383,9 @@
           <w:noProof/>
         </w:rPr>
         <w:drawing>
-          <wp:inline distT="0" distB="0" distL="0" distR="0" wp14:anchorId="0C1DFBCC" wp14:editId="2FB93B26">
-            <wp:extent cx="5762625" cy="3457575"/>
-            <wp:effectExtent l="0" t="0" r="9525" b="9525"/>
+          <wp:inline distT="0" distB="0" distL="0" distR="0" wp14:anchorId="0C1DFBCC" wp14:editId="293294E1">
+            <wp:extent cx="5762624" cy="3457575"/>
+            <wp:effectExtent l="0" t="0" r="0" b="0"/>
             <wp:docPr id="374244088" name="Obrázek 10"/>
             <wp:cNvGraphicFramePr>
               <a:graphicFrameLocks xmlns:a="http://schemas.openxmlformats.org/drawingml/2006/main" noChangeAspect="1"/>
@@ -3958,7 +4394,7 @@
               <a:graphicData uri="http://schemas.openxmlformats.org/drawingml/2006/picture">
                 <pic:pic xmlns:pic="http://schemas.openxmlformats.org/drawingml/2006/picture">
                   <pic:nvPicPr>
-                    <pic:cNvPr id="0" name="Picture 15"/>
+                    <pic:cNvPr id="374244088" name="Obrázek 10"/>
                     <pic:cNvPicPr>
                       <a:picLocks noChangeAspect="1" noChangeArrowheads="1"/>
                     </pic:cNvPicPr>
@@ -3971,7 +4407,6 @@
                         </a:ext>
                       </a:extLst>
                     </a:blip>
-                    <a:srcRect/>
                     <a:stretch>
                       <a:fillRect/>
                     </a:stretch>
@@ -3979,7 +4414,7 @@
                   <pic:spPr bwMode="auto">
                     <a:xfrm>
                       <a:off x="0" y="0"/>
-                      <a:ext cx="5762625" cy="3457575"/>
+                      <a:ext cx="5762624" cy="3457575"/>
                     </a:xfrm>
                     <a:prstGeom prst="rect">
                       <a:avLst/>
@@ -4039,7 +4474,6 @@
                 <w:bCs/>
               </w:rPr>
             </w:pPr>
-            <w:proofErr w:type="spellStart"/>
             <w:r>
               <w:rPr>
                 <w:b/>
@@ -4047,7 +4481,6 @@
               </w:rPr>
               <w:t>Sample_i</w:t>
             </w:r>
-            <w:proofErr w:type="spellEnd"/>
           </w:p>
         </w:tc>
         <w:tc>
@@ -4064,7 +4497,6 @@
                 <w:bCs/>
               </w:rPr>
             </w:pPr>
-            <w:proofErr w:type="spellStart"/>
             <w:r>
               <w:rPr>
                 <w:b/>
@@ -4072,7 +4504,6 @@
               </w:rPr>
               <w:t>Sample_j</w:t>
             </w:r>
-            <w:proofErr w:type="spellEnd"/>
           </w:p>
         </w:tc>
         <w:tc>
@@ -4089,7 +4520,6 @@
                 <w:bCs/>
               </w:rPr>
             </w:pPr>
-            <w:proofErr w:type="spellStart"/>
             <w:r>
               <w:rPr>
                 <w:b/>
@@ -4097,7 +4527,6 @@
               </w:rPr>
               <w:t>Correlation</w:t>
             </w:r>
-            <w:proofErr w:type="spellEnd"/>
           </w:p>
         </w:tc>
       </w:tr>
@@ -4114,8 +4543,14 @@
           <w:p>
             <w:pPr>
               <w:jc w:val="both"/>
-            </w:pPr>
-            <w:r>
+              <w:rPr>
+                <w:color w:val="FF0000"/>
+              </w:rPr>
+            </w:pPr>
+            <w:r>
+              <w:rPr>
+                <w:color w:val="FF0000"/>
+              </w:rPr>
               <w:t>0</w:t>
             </w:r>
           </w:p>
@@ -4129,8 +4564,14 @@
           <w:p>
             <w:pPr>
               <w:jc w:val="both"/>
-            </w:pPr>
-            <w:r>
+              <w:rPr>
+                <w:color w:val="FF0000"/>
+              </w:rPr>
+            </w:pPr>
+            <w:r>
+              <w:rPr>
+                <w:color w:val="FF0000"/>
+              </w:rPr>
               <w:t>solution.txt</w:t>
             </w:r>
           </w:p>
@@ -4144,8 +4585,14 @@
           <w:p>
             <w:pPr>
               <w:jc w:val="both"/>
-            </w:pPr>
-            <w:r>
+              <w:rPr>
+                <w:color w:val="FF0000"/>
+              </w:rPr>
+            </w:pPr>
+            <w:r>
+              <w:rPr>
+                <w:color w:val="FF0000"/>
+              </w:rPr>
               <w:t>5497873243119.880859375</w:t>
             </w:r>
           </w:p>
@@ -4164,8 +4611,14 @@
           <w:p>
             <w:pPr>
               <w:jc w:val="both"/>
-            </w:pPr>
-            <w:r>
+              <w:rPr>
+                <w:color w:val="FF0000"/>
+              </w:rPr>
+            </w:pPr>
+            <w:r>
+              <w:rPr>
+                <w:color w:val="FF0000"/>
+              </w:rPr>
               <w:t>1</w:t>
             </w:r>
           </w:p>
@@ -4179,8 +4632,14 @@
           <w:p>
             <w:pPr>
               <w:jc w:val="both"/>
-            </w:pPr>
-            <w:r>
+              <w:rPr>
+                <w:color w:val="FF0000"/>
+              </w:rPr>
+            </w:pPr>
+            <w:r>
+              <w:rPr>
+                <w:color w:val="FF0000"/>
+              </w:rPr>
               <w:t>no.txt</w:t>
             </w:r>
           </w:p>
@@ -4194,8 +4653,14 @@
           <w:p>
             <w:pPr>
               <w:jc w:val="both"/>
-            </w:pPr>
-            <w:r>
+              <w:rPr>
+                <w:color w:val="FF0000"/>
+              </w:rPr>
+            </w:pPr>
+            <w:r>
+              <w:rPr>
+                <w:color w:val="FF0000"/>
+              </w:rPr>
               <w:t>11517356363749.810546875</w:t>
             </w:r>
           </w:p>
@@ -4214,8 +4679,14 @@
           <w:p>
             <w:pPr>
               <w:jc w:val="both"/>
-            </w:pPr>
-            <w:r>
+              <w:rPr>
+                <w:color w:val="FF0000"/>
+              </w:rPr>
+            </w:pPr>
+            <w:r>
+              <w:rPr>
+                <w:color w:val="FF0000"/>
+              </w:rPr>
               <w:t>2</w:t>
             </w:r>
           </w:p>
@@ -4229,8 +4700,14 @@
           <w:p>
             <w:pPr>
               <w:jc w:val="both"/>
-            </w:pPr>
-            <w:r>
+              <w:rPr>
+                <w:color w:val="FF0000"/>
+              </w:rPr>
+            </w:pPr>
+            <w:r>
+              <w:rPr>
+                <w:color w:val="FF0000"/>
+              </w:rPr>
               <w:t>easy.txt</w:t>
             </w:r>
           </w:p>
@@ -4244,8 +4721,14 @@
           <w:p>
             <w:pPr>
               <w:jc w:val="both"/>
-            </w:pPr>
-            <w:r>
+              <w:rPr>
+                <w:color w:val="FF0000"/>
+              </w:rPr>
+            </w:pPr>
+            <w:r>
+              <w:rPr>
+                <w:color w:val="FF0000"/>
+              </w:rPr>
               <w:t>11852071072171.205078125</w:t>
             </w:r>
           </w:p>
@@ -4264,8 +4747,14 @@
           <w:p>
             <w:pPr>
               <w:jc w:val="both"/>
-            </w:pPr>
-            <w:r>
+              <w:rPr>
+                <w:color w:val="FF0000"/>
+              </w:rPr>
+            </w:pPr>
+            <w:r>
+              <w:rPr>
+                <w:color w:val="FF0000"/>
+              </w:rPr>
               <w:t>3</w:t>
             </w:r>
           </w:p>
@@ -4279,8 +4768,14 @@
           <w:p>
             <w:pPr>
               <w:jc w:val="both"/>
-            </w:pPr>
-            <w:r>
+              <w:rPr>
+                <w:color w:val="FF0000"/>
+              </w:rPr>
+            </w:pPr>
+            <w:r>
+              <w:rPr>
+                <w:color w:val="FF0000"/>
+              </w:rPr>
               <w:t>fail.txt</w:t>
             </w:r>
           </w:p>
@@ -4294,8 +4789,14 @@
           <w:p>
             <w:pPr>
               <w:jc w:val="both"/>
-            </w:pPr>
-            <w:r>
+              <w:rPr>
+                <w:color w:val="FF0000"/>
+              </w:rPr>
+            </w:pPr>
+            <w:r>
+              <w:rPr>
+                <w:color w:val="FF0000"/>
+              </w:rPr>
               <w:t>20825545690.62029266357421875</w:t>
             </w:r>
           </w:p>
@@ -4314,8 +4815,14 @@
           <w:p>
             <w:pPr>
               <w:jc w:val="both"/>
-            </w:pPr>
-            <w:r>
+              <w:rPr>
+                <w:color w:val="FF0000"/>
+              </w:rPr>
+            </w:pPr>
+            <w:r>
+              <w:rPr>
+                <w:color w:val="FF0000"/>
+              </w:rPr>
               <w:t>4</w:t>
             </w:r>
           </w:p>
@@ -4329,8 +4836,14 @@
           <w:p>
             <w:pPr>
               <w:jc w:val="both"/>
-            </w:pPr>
-            <w:r>
+              <w:rPr>
+                <w:color w:val="FF0000"/>
+              </w:rPr>
+            </w:pPr>
+            <w:r>
+              <w:rPr>
+                <w:color w:val="FF0000"/>
+              </w:rPr>
               <w:t>succeed.txt</w:t>
             </w:r>
           </w:p>
@@ -4344,8 +4857,14 @@
           <w:p>
             <w:pPr>
               <w:jc w:val="both"/>
-            </w:pPr>
-            <w:r>
+              <w:rPr>
+                <w:color w:val="FF0000"/>
+              </w:rPr>
+            </w:pPr>
+            <w:r>
+              <w:rPr>
+                <w:color w:val="FF0000"/>
+              </w:rPr>
               <w:t>2488826395092.23828125</w:t>
             </w:r>
           </w:p>
@@ -4364,8 +4883,14 @@
           <w:p>
             <w:pPr>
               <w:jc w:val="both"/>
-            </w:pPr>
-            <w:r>
+              <w:rPr>
+                <w:color w:val="FF0000"/>
+              </w:rPr>
+            </w:pPr>
+            <w:r>
+              <w:rPr>
+                <w:color w:val="FF0000"/>
+              </w:rPr>
               <w:t>5</w:t>
             </w:r>
           </w:p>
@@ -4379,8 +4904,14 @@
           <w:p>
             <w:pPr>
               <w:jc w:val="both"/>
-            </w:pPr>
-            <w:r>
+              <w:rPr>
+                <w:color w:val="FF0000"/>
+              </w:rPr>
+            </w:pPr>
+            <w:r>
+              <w:rPr>
+                <w:color w:val="FF0000"/>
+              </w:rPr>
               <w:t>disaster.txt</w:t>
             </w:r>
           </w:p>
@@ -4394,8 +4925,14 @@
           <w:p>
             <w:pPr>
               <w:jc w:val="both"/>
-            </w:pPr>
-            <w:r>
+              <w:rPr>
+                <w:color w:val="FF0000"/>
+              </w:rPr>
+            </w:pPr>
+            <w:r>
+              <w:rPr>
+                <w:color w:val="FF0000"/>
+              </w:rPr>
               <w:t>2254978166341.189453125</w:t>
             </w:r>
           </w:p>
@@ -4414,8 +4951,14 @@
           <w:p>
             <w:pPr>
               <w:jc w:val="both"/>
-            </w:pPr>
-            <w:r>
+              <w:rPr>
+                <w:color w:val="FF0000"/>
+              </w:rPr>
+            </w:pPr>
+            <w:r>
+              <w:rPr>
+                <w:color w:val="FF0000"/>
+              </w:rPr>
               <w:t>6</w:t>
             </w:r>
           </w:p>
@@ -4429,8 +4972,14 @@
           <w:p>
             <w:pPr>
               <w:jc w:val="both"/>
-            </w:pPr>
-            <w:r>
+              <w:rPr>
+                <w:color w:val="FF0000"/>
+              </w:rPr>
+            </w:pPr>
+            <w:r>
+              <w:rPr>
+                <w:color w:val="FF0000"/>
+              </w:rPr>
               <w:t>idea.txt</w:t>
             </w:r>
           </w:p>
@@ -4444,8 +4993,14 @@
           <w:p>
             <w:pPr>
               <w:jc w:val="both"/>
-            </w:pPr>
-            <w:r>
+              <w:rPr>
+                <w:color w:val="FF0000"/>
+              </w:rPr>
+            </w:pPr>
+            <w:r>
+              <w:rPr>
+                <w:color w:val="FF0000"/>
+              </w:rPr>
               <w:t>95682460464.374725341796875</w:t>
             </w:r>
           </w:p>
@@ -4464,8 +5019,14 @@
           <w:p>
             <w:pPr>
               <w:jc w:val="both"/>
-            </w:pPr>
-            <w:r>
+              <w:rPr>
+                <w:color w:val="FF0000"/>
+              </w:rPr>
+            </w:pPr>
+            <w:r>
+              <w:rPr>
+                <w:color w:val="FF0000"/>
+              </w:rPr>
               <w:t>7</w:t>
             </w:r>
           </w:p>
@@ -4479,8 +5040,14 @@
           <w:p>
             <w:pPr>
               <w:jc w:val="both"/>
-            </w:pPr>
-            <w:r>
+              <w:rPr>
+                <w:color w:val="FF0000"/>
+              </w:rPr>
+            </w:pPr>
+            <w:r>
+              <w:rPr>
+                <w:color w:val="FF0000"/>
+              </w:rPr>
               <w:t>time.txt</w:t>
             </w:r>
           </w:p>
@@ -4494,8 +5061,14 @@
           <w:p>
             <w:pPr>
               <w:jc w:val="both"/>
-            </w:pPr>
-            <w:r>
+              <w:rPr>
+                <w:color w:val="FF0000"/>
+              </w:rPr>
+            </w:pPr>
+            <w:r>
+              <w:rPr>
+                <w:color w:val="FF0000"/>
+              </w:rPr>
               <w:t>73297359822.5860595703125</w:t>
             </w:r>
           </w:p>
@@ -4514,8 +5087,14 @@
           <w:p>
             <w:pPr>
               <w:jc w:val="both"/>
-            </w:pPr>
-            <w:r>
+              <w:rPr>
+                <w:color w:val="FF0000"/>
+              </w:rPr>
+            </w:pPr>
+            <w:r>
+              <w:rPr>
+                <w:color w:val="FF0000"/>
+              </w:rPr>
               <w:t>8</w:t>
             </w:r>
           </w:p>
@@ -4529,8 +5108,14 @@
           <w:p>
             <w:pPr>
               <w:jc w:val="both"/>
-            </w:pPr>
-            <w:r>
+              <w:rPr>
+                <w:color w:val="FF0000"/>
+              </w:rPr>
+            </w:pPr>
+            <w:r>
+              <w:rPr>
+                <w:color w:val="FF0000"/>
+              </w:rPr>
               <w:t>mistake.txt</w:t>
             </w:r>
           </w:p>
@@ -4544,8 +5129,14 @@
           <w:p>
             <w:pPr>
               <w:jc w:val="both"/>
-            </w:pPr>
-            <w:r>
+              <w:rPr>
+                <w:color w:val="FF0000"/>
+              </w:rPr>
+            </w:pPr>
+            <w:r>
+              <w:rPr>
+                <w:color w:val="FF0000"/>
+              </w:rPr>
               <w:t>23100857218.266819000244140625</w:t>
             </w:r>
           </w:p>
@@ -4564,8 +5155,14 @@
           <w:p>
             <w:pPr>
               <w:jc w:val="both"/>
-            </w:pPr>
-            <w:r>
+              <w:rPr>
+                <w:color w:val="FF0000"/>
+              </w:rPr>
+            </w:pPr>
+            <w:r>
+              <w:rPr>
+                <w:color w:val="FF0000"/>
+              </w:rPr>
               <w:t>9</w:t>
             </w:r>
           </w:p>
@@ -4579,8 +5176,14 @@
           <w:p>
             <w:pPr>
               <w:jc w:val="both"/>
-            </w:pPr>
-            <w:r>
+              <w:rPr>
+                <w:color w:val="FF0000"/>
+              </w:rPr>
+            </w:pPr>
+            <w:r>
+              <w:rPr>
+                <w:color w:val="FF0000"/>
+              </w:rPr>
               <w:t>advice.txt</w:t>
             </w:r>
           </w:p>
@@ -4594,8 +5197,14 @@
           <w:p>
             <w:pPr>
               <w:jc w:val="both"/>
-            </w:pPr>
-            <w:r>
+              <w:rPr>
+                <w:color w:val="FF0000"/>
+              </w:rPr>
+            </w:pPr>
+            <w:r>
+              <w:rPr>
+                <w:color w:val="FF0000"/>
+              </w:rPr>
               <w:t>0</w:t>
             </w:r>
           </w:p>
@@ -4608,6 +5217,9 @@
       </w:pPr>
     </w:p>
     <w:p>
+      <w:pPr>
+        <w:pStyle w:val="Nadpis2"/>
+      </w:pPr>
       <w:r>
         <w:br w:type="page"/>
       </w:r>
@@ -4618,13 +5230,7 @@
       </w:pPr>
       <w:r>
         <w:lastRenderedPageBreak/>
-        <w:t>Porovnání – Singal</w:t>
-      </w:r>
-      <w:r>
-        <w:t>3</w:t>
-      </w:r>
-      <w:r>
-        <w:t>.txt</w:t>
+        <w:t>Porovnání – Singal3.txt</w:t>
       </w:r>
     </w:p>
     <w:p>
@@ -4635,22 +5241,11 @@
         </w:rPr>
       </w:pPr>
       <w:r>
-        <w:t xml:space="preserve">U </w:t>
+        <w:t xml:space="preserve">U třetího referenčního signálu </w:t>
       </w:r>
       <w:r>
-        <w:t>třetího</w:t>
+        <w:t xml:space="preserve">se i přes veškerou naši snahu nepodařilo správně identifikovat všechna slova, která vidíme na následujícím grafu tak, jak bychom si představovali. Došlo k tomu z důvodu velice kolísavé prahové hodnoty, kdy jsme nenalezli žádnou „univerzální“ hodnotu, kde bychom detekovali všechna slova a neměli plno slov „prázdných“. </w:t>
       </w:r>
-      <w:r>
-        <w:t xml:space="preserve"> referenčního signálu bylo potřeba nastavit </w:t>
-      </w:r>
-      <w:proofErr w:type="spellStart"/>
-      <w:r>
-        <w:rPr>
-          <w:color w:val="FF0000"/>
-        </w:rPr>
-        <w:t>treshold</w:t>
-      </w:r>
-      <w:proofErr w:type="spellEnd"/>
     </w:p>
     <w:p>
       <w:pPr>
@@ -4661,9 +5256,9 @@
           <w:noProof/>
         </w:rPr>
         <w:drawing>
-          <wp:inline distT="0" distB="0" distL="0" distR="0" wp14:anchorId="53AB60C1" wp14:editId="3785933B">
-            <wp:extent cx="5762625" cy="2876550"/>
-            <wp:effectExtent l="0" t="0" r="9525" b="0"/>
+          <wp:inline distT="0" distB="0" distL="0" distR="0" wp14:anchorId="53AB60C1" wp14:editId="21B2FD8D">
+            <wp:extent cx="5711453" cy="2876550"/>
+            <wp:effectExtent l="0" t="0" r="3810" b="0"/>
             <wp:docPr id="93713386" name="Obrázek 11"/>
             <wp:cNvGraphicFramePr>
               <a:graphicFrameLocks xmlns:a="http://schemas.openxmlformats.org/drawingml/2006/main" noChangeAspect="1"/>
@@ -4672,20 +5267,19 @@
               <a:graphicData uri="http://schemas.openxmlformats.org/drawingml/2006/picture">
                 <pic:pic xmlns:pic="http://schemas.openxmlformats.org/drawingml/2006/picture">
                   <pic:nvPicPr>
-                    <pic:cNvPr id="0" name="Picture 16"/>
+                    <pic:cNvPr id="93713386" name="Obrázek 11"/>
                     <pic:cNvPicPr>
                       <a:picLocks noChangeAspect="1" noChangeArrowheads="1"/>
                     </pic:cNvPicPr>
                   </pic:nvPicPr>
                   <pic:blipFill>
-                    <a:blip r:embed="rId10">
+                    <a:blip r:embed="rId10" cstate="print">
                       <a:extLst>
                         <a:ext uri="{28A0092B-C50C-407E-A947-70E740481C1C}">
                           <a14:useLocalDpi xmlns:a14="http://schemas.microsoft.com/office/drawing/2010/main" val="0"/>
                         </a:ext>
                       </a:extLst>
                     </a:blip>
-                    <a:srcRect/>
                     <a:stretch>
                       <a:fillRect/>
                     </a:stretch>
@@ -4693,7 +5287,7 @@
                   <pic:spPr bwMode="auto">
                     <a:xfrm>
                       <a:off x="0" y="0"/>
-                      <a:ext cx="5762625" cy="2876550"/>
+                      <a:ext cx="5711453" cy="2876550"/>
                     </a:xfrm>
                     <a:prstGeom prst="rect">
                       <a:avLst/>
@@ -4719,9 +5313,9 @@
           <w:noProof/>
         </w:rPr>
         <w:drawing>
-          <wp:inline distT="0" distB="0" distL="0" distR="0" wp14:anchorId="5159FB13" wp14:editId="45FE8B4D">
-            <wp:extent cx="5762625" cy="3457575"/>
-            <wp:effectExtent l="0" t="0" r="9525" b="9525"/>
+          <wp:inline distT="0" distB="0" distL="0" distR="0" wp14:anchorId="5159FB13" wp14:editId="08737E62">
+            <wp:extent cx="5762624" cy="3457575"/>
+            <wp:effectExtent l="0" t="0" r="0" b="0"/>
             <wp:docPr id="521705982" name="Obrázek 12"/>
             <wp:cNvGraphicFramePr>
               <a:graphicFrameLocks xmlns:a="http://schemas.openxmlformats.org/drawingml/2006/main" noChangeAspect="1"/>
@@ -4730,7 +5324,7 @@
               <a:graphicData uri="http://schemas.openxmlformats.org/drawingml/2006/picture">
                 <pic:pic xmlns:pic="http://schemas.openxmlformats.org/drawingml/2006/picture">
                   <pic:nvPicPr>
-                    <pic:cNvPr id="0" name="Picture 17"/>
+                    <pic:cNvPr id="521705982" name="Obrázek 12"/>
                     <pic:cNvPicPr>
                       <a:picLocks noChangeAspect="1" noChangeArrowheads="1"/>
                     </pic:cNvPicPr>
@@ -4743,7 +5337,6 @@
                         </a:ext>
                       </a:extLst>
                     </a:blip>
-                    <a:srcRect/>
                     <a:stretch>
                       <a:fillRect/>
                     </a:stretch>
@@ -4751,7 +5344,7 @@
                   <pic:spPr bwMode="auto">
                     <a:xfrm>
                       <a:off x="0" y="0"/>
-                      <a:ext cx="5762625" cy="3457575"/>
+                      <a:ext cx="5762624" cy="3457575"/>
                     </a:xfrm>
                     <a:prstGeom prst="rect">
                       <a:avLst/>
@@ -4772,10 +5365,207 @@
       <w:pPr>
         <w:jc w:val="both"/>
       </w:pPr>
+      <w:r>
+        <w:lastRenderedPageBreak/>
+        <w:t>Zde ukázka 2 takových míst v našem signálu</w:t>
+      </w:r>
+      <w:r>
+        <w:t>, kde byla prahová hodnota blízko identifikace slova.</w:t>
+      </w:r>
+      <w:r>
+        <w:rPr>
+          <w:noProof/>
+        </w:rPr>
+        <w:drawing>
+          <wp:inline distT="0" distB="0" distL="0" distR="0" wp14:anchorId="03DA61C5" wp14:editId="18A58A2F">
+            <wp:extent cx="5760720" cy="2901315"/>
+            <wp:effectExtent l="0" t="0" r="0" b="0"/>
+            <wp:docPr id="145824123" name="Obrázek 1" descr="Obsah obrázku snímek obrazovky, diagram, Vykreslený graf, design&#10;&#10;Popis byl vytvořen automaticky"/>
+            <wp:cNvGraphicFramePr>
+              <a:graphicFrameLocks xmlns:a="http://schemas.openxmlformats.org/drawingml/2006/main" noChangeAspect="1"/>
+            </wp:cNvGraphicFramePr>
+            <a:graphic xmlns:a="http://schemas.openxmlformats.org/drawingml/2006/main">
+              <a:graphicData uri="http://schemas.openxmlformats.org/drawingml/2006/picture">
+                <pic:pic xmlns:pic="http://schemas.openxmlformats.org/drawingml/2006/picture">
+                  <pic:nvPicPr>
+                    <pic:cNvPr id="145824123" name="Obrázek 1" descr="Obsah obrázku snímek obrazovky, diagram, Vykreslený graf, design&#10;&#10;Popis byl vytvořen automaticky"/>
+                    <pic:cNvPicPr/>
+                  </pic:nvPicPr>
+                  <pic:blipFill>
+                    <a:blip r:embed="rId12" cstate="print">
+                      <a:extLst>
+                        <a:ext uri="{28A0092B-C50C-407E-A947-70E740481C1C}">
+                          <a14:useLocalDpi xmlns:a14="http://schemas.microsoft.com/office/drawing/2010/main" val="0"/>
+                        </a:ext>
+                      </a:extLst>
+                    </a:blip>
+                    <a:stretch>
+                      <a:fillRect/>
+                    </a:stretch>
+                  </pic:blipFill>
+                  <pic:spPr>
+                    <a:xfrm>
+                      <a:off x="0" y="0"/>
+                      <a:ext cx="5760720" cy="2901315"/>
+                    </a:xfrm>
+                    <a:prstGeom prst="rect">
+                      <a:avLst/>
+                    </a:prstGeom>
+                  </pic:spPr>
+                </pic:pic>
+              </a:graphicData>
+            </a:graphic>
+          </wp:inline>
+        </w:drawing>
+      </w:r>
+      <w:r>
+        <w:rPr>
+          <w:noProof/>
+        </w:rPr>
+        <w:drawing>
+          <wp:inline distT="0" distB="0" distL="0" distR="0" wp14:anchorId="052095EB" wp14:editId="5615AD48">
+            <wp:extent cx="5760720" cy="2901315"/>
+            <wp:effectExtent l="0" t="0" r="0" b="0"/>
+            <wp:docPr id="185584944" name="Obrázek 2" descr="Obsah obrázku snímek obrazovky, text, řada/pruh, design&#10;&#10;Popis byl vytvořen automaticky"/>
+            <wp:cNvGraphicFramePr>
+              <a:graphicFrameLocks xmlns:a="http://schemas.openxmlformats.org/drawingml/2006/main" noChangeAspect="1"/>
+            </wp:cNvGraphicFramePr>
+            <a:graphic xmlns:a="http://schemas.openxmlformats.org/drawingml/2006/main">
+              <a:graphicData uri="http://schemas.openxmlformats.org/drawingml/2006/picture">
+                <pic:pic xmlns:pic="http://schemas.openxmlformats.org/drawingml/2006/picture">
+                  <pic:nvPicPr>
+                    <pic:cNvPr id="185584944" name="Obrázek 2" descr="Obsah obrázku snímek obrazovky, text, řada/pruh, design&#10;&#10;Popis byl vytvořen automaticky"/>
+                    <pic:cNvPicPr/>
+                  </pic:nvPicPr>
+                  <pic:blipFill>
+                    <a:blip r:embed="rId13" cstate="print">
+                      <a:extLst>
+                        <a:ext uri="{28A0092B-C50C-407E-A947-70E740481C1C}">
+                          <a14:useLocalDpi xmlns:a14="http://schemas.microsoft.com/office/drawing/2010/main" val="0"/>
+                        </a:ext>
+                      </a:extLst>
+                    </a:blip>
+                    <a:stretch>
+                      <a:fillRect/>
+                    </a:stretch>
+                  </pic:blipFill>
+                  <pic:spPr>
+                    <a:xfrm>
+                      <a:off x="0" y="0"/>
+                      <a:ext cx="5760720" cy="2901315"/>
+                    </a:xfrm>
+                    <a:prstGeom prst="rect">
+                      <a:avLst/>
+                    </a:prstGeom>
+                  </pic:spPr>
+                </pic:pic>
+              </a:graphicData>
+            </a:graphic>
+          </wp:inline>
+        </w:drawing>
+      </w:r>
+    </w:p>
+    <w:p>
+      <w:pPr>
+        <w:jc w:val="both"/>
+      </w:pPr>
     </w:p>
     <w:p>
       <w:r>
         <w:br w:type="page"/>
+      </w:r>
+      <w:r>
+        <w:rPr>
+          <w:noProof/>
+        </w:rPr>
+        <w:lastRenderedPageBreak/>
+        <w:drawing>
+          <wp:inline distT="0" distB="0" distL="0" distR="0" wp14:anchorId="1484A5D6" wp14:editId="76A94053">
+            <wp:extent cx="5719018" cy="2880360"/>
+            <wp:effectExtent l="0" t="0" r="0" b="0"/>
+            <wp:docPr id="1469874213" name="Obrázek 3"/>
+            <wp:cNvGraphicFramePr>
+              <a:graphicFrameLocks xmlns:a="http://schemas.openxmlformats.org/drawingml/2006/main" noChangeAspect="1"/>
+            </wp:cNvGraphicFramePr>
+            <a:graphic xmlns:a="http://schemas.openxmlformats.org/drawingml/2006/main">
+              <a:graphicData uri="http://schemas.openxmlformats.org/drawingml/2006/picture">
+                <pic:pic xmlns:pic="http://schemas.openxmlformats.org/drawingml/2006/picture">
+                  <pic:nvPicPr>
+                    <pic:cNvPr id="1469874213" name="Obrázek 3"/>
+                    <pic:cNvPicPr/>
+                  </pic:nvPicPr>
+                  <pic:blipFill>
+                    <a:blip r:embed="rId14" cstate="print">
+                      <a:extLst>
+                        <a:ext uri="{28A0092B-C50C-407E-A947-70E740481C1C}">
+                          <a14:useLocalDpi xmlns:a14="http://schemas.microsoft.com/office/drawing/2010/main" val="0"/>
+                        </a:ext>
+                      </a:extLst>
+                    </a:blip>
+                    <a:stretch>
+                      <a:fillRect/>
+                    </a:stretch>
+                  </pic:blipFill>
+                  <pic:spPr>
+                    <a:xfrm>
+                      <a:off x="0" y="0"/>
+                      <a:ext cx="5719018" cy="2880360"/>
+                    </a:xfrm>
+                    <a:prstGeom prst="rect">
+                      <a:avLst/>
+                    </a:prstGeom>
+                  </pic:spPr>
+                </pic:pic>
+              </a:graphicData>
+            </a:graphic>
+          </wp:inline>
+        </w:drawing>
+      </w:r>
+      <w:r>
+        <w:rPr>
+          <w:noProof/>
+        </w:rPr>
+        <w:drawing>
+          <wp:inline distT="0" distB="0" distL="0" distR="0" wp14:anchorId="3041F237" wp14:editId="669F99C4">
+            <wp:extent cx="5760720" cy="2880360"/>
+            <wp:effectExtent l="0" t="0" r="0" b="0"/>
+            <wp:docPr id="686613407" name="Obrázek 4" descr="Obsah obrázku text, snímek obrazovky, řada/pruh, diagram&#10;&#10;Popis byl vytvořen automaticky"/>
+            <wp:cNvGraphicFramePr>
+              <a:graphicFrameLocks xmlns:a="http://schemas.openxmlformats.org/drawingml/2006/main" noChangeAspect="1"/>
+            </wp:cNvGraphicFramePr>
+            <a:graphic xmlns:a="http://schemas.openxmlformats.org/drawingml/2006/main">
+              <a:graphicData uri="http://schemas.openxmlformats.org/drawingml/2006/picture">
+                <pic:pic xmlns:pic="http://schemas.openxmlformats.org/drawingml/2006/picture">
+                  <pic:nvPicPr>
+                    <pic:cNvPr id="686613407" name="Obrázek 4" descr="Obsah obrázku text, snímek obrazovky, řada/pruh, diagram&#10;&#10;Popis byl vytvořen automaticky"/>
+                    <pic:cNvPicPr/>
+                  </pic:nvPicPr>
+                  <pic:blipFill>
+                    <a:blip r:embed="rId15">
+                      <a:extLst>
+                        <a:ext uri="{28A0092B-C50C-407E-A947-70E740481C1C}">
+                          <a14:useLocalDpi xmlns:a14="http://schemas.microsoft.com/office/drawing/2010/main" val="0"/>
+                        </a:ext>
+                      </a:extLst>
+                    </a:blip>
+                    <a:stretch>
+                      <a:fillRect/>
+                    </a:stretch>
+                  </pic:blipFill>
+                  <pic:spPr>
+                    <a:xfrm>
+                      <a:off x="0" y="0"/>
+                      <a:ext cx="5760720" cy="2880360"/>
+                    </a:xfrm>
+                    <a:prstGeom prst="rect">
+                      <a:avLst/>
+                    </a:prstGeom>
+                  </pic:spPr>
+                </pic:pic>
+              </a:graphicData>
+            </a:graphic>
+          </wp:inline>
+        </w:drawing>
       </w:r>
     </w:p>
     <w:tbl>
@@ -4807,16 +5597,13 @@
                 <w:bCs/>
               </w:rPr>
             </w:pPr>
-            <w:proofErr w:type="spellStart"/>
             <w:r>
               <w:rPr>
                 <w:b/>
                 <w:bCs/>
               </w:rPr>
-              <w:lastRenderedPageBreak/>
               <w:t>Sample_i</w:t>
             </w:r>
-            <w:proofErr w:type="spellEnd"/>
           </w:p>
         </w:tc>
         <w:tc>
@@ -4833,7 +5620,6 @@
                 <w:bCs/>
               </w:rPr>
             </w:pPr>
-            <w:proofErr w:type="spellStart"/>
             <w:r>
               <w:rPr>
                 <w:b/>
@@ -4841,7 +5627,6 @@
               </w:rPr>
               <w:t>Sample_j</w:t>
             </w:r>
-            <w:proofErr w:type="spellEnd"/>
           </w:p>
         </w:tc>
         <w:tc>
@@ -4858,7 +5643,6 @@
                 <w:bCs/>
               </w:rPr>
             </w:pPr>
-            <w:proofErr w:type="spellStart"/>
             <w:r>
               <w:rPr>
                 <w:b/>
@@ -4866,7 +5650,6 @@
               </w:rPr>
               <w:t>Correlation</w:t>
             </w:r>
-            <w:proofErr w:type="spellEnd"/>
           </w:p>
         </w:tc>
       </w:tr>
@@ -4883,8 +5666,14 @@
           <w:p>
             <w:pPr>
               <w:jc w:val="both"/>
-            </w:pPr>
-            <w:r>
+              <w:rPr>
+                <w:color w:val="FF0000"/>
+              </w:rPr>
+            </w:pPr>
+            <w:r>
+              <w:rPr>
+                <w:color w:val="FF0000"/>
+              </w:rPr>
               <w:t>0</w:t>
             </w:r>
           </w:p>
@@ -4898,8 +5687,14 @@
           <w:p>
             <w:pPr>
               <w:jc w:val="both"/>
-            </w:pPr>
-            <w:r>
+              <w:rPr>
+                <w:color w:val="FF0000"/>
+              </w:rPr>
+            </w:pPr>
+            <w:r>
+              <w:rPr>
+                <w:color w:val="FF0000"/>
+              </w:rPr>
               <w:t>idea.txt</w:t>
             </w:r>
           </w:p>
@@ -4913,8 +5708,14 @@
           <w:p>
             <w:pPr>
               <w:jc w:val="both"/>
-            </w:pPr>
-            <w:r>
+              <w:rPr>
+                <w:color w:val="FF0000"/>
+              </w:rPr>
+            </w:pPr>
+            <w:r>
+              <w:rPr>
+                <w:color w:val="FF0000"/>
+              </w:rPr>
               <w:t>12807319248783.603515625</w:t>
             </w:r>
           </w:p>
@@ -4933,8 +5734,14 @@
           <w:p>
             <w:pPr>
               <w:jc w:val="both"/>
-            </w:pPr>
-            <w:r>
+              <w:rPr>
+                <w:color w:val="FF0000"/>
+              </w:rPr>
+            </w:pPr>
+            <w:r>
+              <w:rPr>
+                <w:color w:val="FF0000"/>
+              </w:rPr>
               <w:t>1</w:t>
             </w:r>
           </w:p>
@@ -4948,8 +5755,14 @@
           <w:p>
             <w:pPr>
               <w:jc w:val="both"/>
-            </w:pPr>
-            <w:r>
+              <w:rPr>
+                <w:color w:val="FF0000"/>
+              </w:rPr>
+            </w:pPr>
+            <w:r>
+              <w:rPr>
+                <w:color w:val="FF0000"/>
+              </w:rPr>
               <w:t>disaster.txt</w:t>
             </w:r>
           </w:p>
@@ -4963,8 +5776,14 @@
           <w:p>
             <w:pPr>
               <w:jc w:val="both"/>
-            </w:pPr>
-            <w:r>
+              <w:rPr>
+                <w:color w:val="FF0000"/>
+              </w:rPr>
+            </w:pPr>
+            <w:r>
+              <w:rPr>
+                <w:color w:val="FF0000"/>
+              </w:rPr>
               <w:t>9747958721481.2265625</w:t>
             </w:r>
           </w:p>
@@ -4983,8 +5802,14 @@
           <w:p>
             <w:pPr>
               <w:jc w:val="both"/>
-            </w:pPr>
-            <w:r>
+              <w:rPr>
+                <w:color w:val="FF0000"/>
+              </w:rPr>
+            </w:pPr>
+            <w:r>
+              <w:rPr>
+                <w:color w:val="FF0000"/>
+              </w:rPr>
               <w:t>2</w:t>
             </w:r>
           </w:p>
@@ -4998,8 +5823,14 @@
           <w:p>
             <w:pPr>
               <w:jc w:val="both"/>
-            </w:pPr>
-            <w:r>
+              <w:rPr>
+                <w:color w:val="FF0000"/>
+              </w:rPr>
+            </w:pPr>
+            <w:r>
+              <w:rPr>
+                <w:color w:val="FF0000"/>
+              </w:rPr>
               <w:t>no.txt</w:t>
             </w:r>
           </w:p>
@@ -5013,8 +5844,14 @@
           <w:p>
             <w:pPr>
               <w:jc w:val="both"/>
-            </w:pPr>
-            <w:r>
+              <w:rPr>
+                <w:color w:val="FF0000"/>
+              </w:rPr>
+            </w:pPr>
+            <w:r>
+              <w:rPr>
+                <w:color w:val="FF0000"/>
+              </w:rPr>
               <w:t>58003549374923.53125</w:t>
             </w:r>
           </w:p>
@@ -5033,8 +5870,14 @@
           <w:p>
             <w:pPr>
               <w:jc w:val="both"/>
-            </w:pPr>
-            <w:r>
+              <w:rPr>
+                <w:color w:val="FF0000"/>
+              </w:rPr>
+            </w:pPr>
+            <w:r>
+              <w:rPr>
+                <w:color w:val="FF0000"/>
+              </w:rPr>
               <w:t>3</w:t>
             </w:r>
           </w:p>
@@ -5048,8 +5891,14 @@
           <w:p>
             <w:pPr>
               <w:jc w:val="both"/>
-            </w:pPr>
-            <w:r>
+              <w:rPr>
+                <w:color w:val="FF0000"/>
+              </w:rPr>
+            </w:pPr>
+            <w:r>
+              <w:rPr>
+                <w:color w:val="FF0000"/>
+              </w:rPr>
               <w:t>solution.txt</w:t>
             </w:r>
           </w:p>
@@ -5063,8 +5912,14 @@
           <w:p>
             <w:pPr>
               <w:jc w:val="both"/>
-            </w:pPr>
-            <w:r>
+              <w:rPr>
+                <w:color w:val="FF0000"/>
+              </w:rPr>
+            </w:pPr>
+            <w:r>
+              <w:rPr>
+                <w:color w:val="FF0000"/>
+              </w:rPr>
               <w:t>832173783.885272979736328125</w:t>
             </w:r>
           </w:p>
@@ -5083,8 +5938,14 @@
           <w:p>
             <w:pPr>
               <w:jc w:val="both"/>
-            </w:pPr>
-            <w:r>
+              <w:rPr>
+                <w:color w:val="FF0000"/>
+              </w:rPr>
+            </w:pPr>
+            <w:r>
+              <w:rPr>
+                <w:color w:val="FF0000"/>
+              </w:rPr>
               <w:t>4</w:t>
             </w:r>
           </w:p>
@@ -5098,8 +5959,14 @@
           <w:p>
             <w:pPr>
               <w:jc w:val="both"/>
-            </w:pPr>
-            <w:r>
+              <w:rPr>
+                <w:color w:val="FF0000"/>
+              </w:rPr>
+            </w:pPr>
+            <w:r>
+              <w:rPr>
+                <w:color w:val="FF0000"/>
+              </w:rPr>
               <w:t>no.txt</w:t>
             </w:r>
           </w:p>
@@ -5113,8 +5980,14 @@
           <w:p>
             <w:pPr>
               <w:jc w:val="both"/>
-            </w:pPr>
-            <w:r>
+              <w:rPr>
+                <w:color w:val="FF0000"/>
+              </w:rPr>
+            </w:pPr>
+            <w:r>
+              <w:rPr>
+                <w:color w:val="FF0000"/>
+              </w:rPr>
               <w:t>91933651715761.078125</w:t>
             </w:r>
           </w:p>
@@ -5133,8 +6006,14 @@
           <w:p>
             <w:pPr>
               <w:jc w:val="both"/>
-            </w:pPr>
-            <w:r>
+              <w:rPr>
+                <w:color w:val="FF0000"/>
+              </w:rPr>
+            </w:pPr>
+            <w:r>
+              <w:rPr>
+                <w:color w:val="FF0000"/>
+              </w:rPr>
               <w:t>5</w:t>
             </w:r>
           </w:p>
@@ -5148,8 +6027,14 @@
           <w:p>
             <w:pPr>
               <w:jc w:val="both"/>
-            </w:pPr>
-            <w:r>
+              <w:rPr>
+                <w:color w:val="FF0000"/>
+              </w:rPr>
+            </w:pPr>
+            <w:r>
+              <w:rPr>
+                <w:color w:val="FF0000"/>
+              </w:rPr>
               <w:t>advice.txt</w:t>
             </w:r>
           </w:p>
@@ -5163,8 +6048,14 @@
           <w:p>
             <w:pPr>
               <w:jc w:val="both"/>
-            </w:pPr>
-            <w:r>
+              <w:rPr>
+                <w:color w:val="FF0000"/>
+              </w:rPr>
+            </w:pPr>
+            <w:r>
+              <w:rPr>
+                <w:color w:val="FF0000"/>
+              </w:rPr>
               <w:t>0</w:t>
             </w:r>
           </w:p>
@@ -5175,6 +6066,23 @@
       <w:pPr>
         <w:jc w:val="both"/>
       </w:pPr>
+    </w:p>
+    <w:p>
+      <w:pPr>
+        <w:pStyle w:val="Nadpis2"/>
+      </w:pPr>
+      <w:r>
+        <w:t>Závěr</w:t>
+      </w:r>
+    </w:p>
+    <w:p>
+      <w:r>
+        <w:t xml:space="preserve">V první iteraci našeho sezení jsme špatně aplikovali Hammingovo okno, které jsme aplikovali na celý signál namísto pouze oddělených slov, to nám celkově pomohlo lépe identifikovat slova v této iteraci, kromě příkladu 3. Myslíme si, že je to způsobeno možnou jinou, či špatnou výslovností jednotlivých slov v zaznamenaném signálu a pomohlo by tomu adaptivní prahování, které jsme používali v první seminární práci. Tím bychom pravděpodobně mohli zlepšit </w:t>
+      </w:r>
+      <w:r>
+        <w:lastRenderedPageBreak/>
+        <w:t>rozpoznávání jednotlivých slov. Dále naše korelace vyšly hodně silně (pro nás nevysvětlitelně) ve prospěch slova Work, které má nejsilnější korelaci téměř s každým slovem z analyzovaných signálů.</w:t>
+      </w:r>
     </w:p>
     <w:sectPr>
       <w:pgSz w:w="11906" w:h="16838"/>
@@ -5789,6 +6697,7 @@
   <w:style w:type="character" w:default="1" w:styleId="Standardnpsmoodstavce">
     <w:name w:val="Default Paragraph Font"/>
     <w:uiPriority w:val="1"/>
+    <w:semiHidden/>
     <w:unhideWhenUsed/>
   </w:style>
   <w:style w:type="table" w:default="1" w:styleId="Normlntabulka">

</xml_diff>